<commit_message>
Gantt da equipa no S2 e enquadramento do S3 coerente com o S2
- S2 (.docx e .xlsx): Gantt sem papéis individuais, tarefas «Em conjunto»
  ou «Por lição + revisão cruzada»; sai a folha «Responsáveis»
- S3: público, situação e plataforma alinhados com o S2
- CLAUDE.md: regra do Gantt de equipa, sem limite de 2 páginas

Co-Authored-By: Claude Opus 5.5 <noreply@anthropic.com>
</commit_message>
<xml_diff>
--- a/Files/P1/S2_MOOC-choice_planning_Grupo1.docx
+++ b/Files/P1/S2_MOOC-choice_planning_Grupo1.docx
@@ -1237,6 +1237,7 @@
     </w:p>
     <w:p>
       <w:pPr>
+        <w:pageBreakBefore/>
         <w:keepNext/>
         <w:spacing w:before="110" w:after="50"/>
         <w:rPr>
@@ -1274,7 +1275,7 @@
           <w:sz w:val="24"/>
           <w:szCs w:val="24"/>
         </w:rPr>
-        <w:t xml:space="preserve"> inicial</w:t>
+        <w:t xml:space="preserve"> da equipa</w:t>
       </w:r>
     </w:p>
     <w:p>
@@ -1290,7 +1291,71 @@
           <w:sz w:val="20"/>
           <w:szCs w:val="20"/>
         </w:rPr>
-        <w:t xml:space="preserve">Cada etapa começa na PL de terça e é submetida no Moodle até à PL seguinte; as células sombreadas marcam as semanas de cada tarefa e ◆ a entrega final. Além da sua lição (secção 4), cada elemento tem um papel: Bruno (coordenação e documentação), Tiago (Matterport), Rodrigo (Udemy), Ricardo (identidade visual e acessibilidade), Evandro (pesquisa e testes).</w:t>
+        <w:t xml:space="preserve">Cada etapa começa na PL de terça e é submetida no Moodle até à PL seguinte; as células sombreadas marcam as semanas de cada tarefa e ◆ a entrega final.</w:t>
+      </w:r>
+    </w:p>
+    <w:p>
+      <w:pPr>
+        <w:spacing w:after="50" w:line="230" w:lineRule="auto"/>
+        <w:rPr>
+          <w:sz w:val="20"/>
+          <w:szCs w:val="20"/>
+        </w:rPr>
+      </w:pPr>
+      <w:r>
+        <w:rPr>
+          <w:sz w:val="20"/>
+          <w:szCs w:val="20"/>
+        </w:rPr>
+        <w:t xml:space="preserve">O Gantt é da equipa e não de cada elemento. As 5 lições seguem o mesmo formato (conteúdo, avaliação e Matterport), por isso cada tarefa avança nas 5 lições ao mesmo tempo. A coluna «Como trabalhamos» diz de que forma:</w:t>
+      </w:r>
+    </w:p>
+    <w:p>
+      <w:pPr>
+        <w:spacing w:after="50" w:line="230" w:lineRule="auto"/>
+        <w:rPr>
+          <w:sz w:val="20"/>
+          <w:szCs w:val="20"/>
+        </w:rPr>
+      </w:pPr>
+      <w:r>
+        <w:rPr>
+          <w:sz w:val="20"/>
+          <w:szCs w:val="20"/>
+        </w:rPr>
+        <w:t xml:space="preserve">• Em conjunto: o grupo decide e faz a tarefa junto, na PL de terça ou em sessões de trabalho do grupo (ex.: identidade visual, captura Matterport, integração na Udemy, testes).</w:t>
+      </w:r>
+    </w:p>
+    <w:p>
+      <w:pPr>
+        <w:spacing w:after="50" w:line="230" w:lineRule="auto"/>
+        <w:rPr>
+          <w:sz w:val="20"/>
+          <w:szCs w:val="20"/>
+        </w:rPr>
+      </w:pPr>
+      <w:r>
+        <w:rPr>
+          <w:sz w:val="20"/>
+          <w:szCs w:val="20"/>
+        </w:rPr>
+        <w:t xml:space="preserve">• Por lição + revisão cruzada: cada elemento faz a parte da sua lição (secção 4) com os modelos comuns, e outro elemento revê-a antes da entrega. Assim as 5 lições ficam coerentes a nível pedagógico, visual e multimédia.</w:t>
+      </w:r>
+    </w:p>
+    <w:p>
+      <w:pPr>
+        <w:spacing w:after="50" w:line="230" w:lineRule="auto"/>
+        <w:rPr>
+          <w:sz w:val="20"/>
+          <w:szCs w:val="20"/>
+        </w:rPr>
+      </w:pPr>
+      <w:r>
+        <w:rPr>
+          <w:sz w:val="20"/>
+          <w:szCs w:val="20"/>
+        </w:rPr>
+        <w:t xml:space="preserve">• Em cada semana o grupo junta o trabalho numa só submissão e decide, com o feedback recebido, o que muda na semana seguinte.</w:t>
       </w:r>
     </w:p>
     <w:p>
@@ -1408,7 +1473,7 @@
                 <w:sz w:val="15"/>
                 <w:szCs w:val="15"/>
               </w:rPr>
-              <w:t>Responsável</w:t>
+              <w:t>Como trabalhamos</w:t>
             </w:r>
           </w:p>
         </w:tc>
@@ -1789,7 +1854,7 @@
                 <w:sz w:val="16"/>
                 <w:szCs w:val="16"/>
               </w:rPr>
-              <w:t>Escolha do tema e enquadramento</w:t>
+              <w:t xml:space="preserve">Tema, enquadramento e público-alvo</w:t>
             </w:r>
           </w:p>
         </w:tc>
@@ -1819,7 +1884,7 @@
                 <w:sz w:val="15"/>
                 <w:szCs w:val="15"/>
               </w:rPr>
-              <w:t>Todos</w:t>
+              <w:t xml:space="preserve">Em conjunto</w:t>
             </w:r>
           </w:p>
         </w:tc>
@@ -2033,23 +2098,7 @@
                 <w:sz w:val="16"/>
                 <w:szCs w:val="16"/>
               </w:rPr>
-              <w:t xml:space="preserve">Pesquisa de </w:t>
-            </w:r>
-            <w:proofErr w:type="spellStart"/>
-            <w:r>
-              <w:rPr>
-                <w:sz w:val="16"/>
-                <w:szCs w:val="16"/>
-              </w:rPr>
-              <w:t>MOOCs</w:t>
-            </w:r>
-            <w:proofErr w:type="spellEnd"/>
-            <w:r>
-              <w:rPr>
-                <w:sz w:val="16"/>
-                <w:szCs w:val="16"/>
-              </w:rPr>
-              <w:t xml:space="preserve"> existentes</w:t>
+              <w:t xml:space="preserve">Pesquisa de MOOCs e escolha da plataforma</w:t>
             </w:r>
           </w:p>
         </w:tc>
@@ -2079,7 +2128,7 @@
                 <w:sz w:val="15"/>
                 <w:szCs w:val="15"/>
               </w:rPr>
-              <w:t>Evandro Carvalho</w:t>
+              <w:t xml:space="preserve">Em conjunto</w:t>
             </w:r>
           </w:p>
         </w:tc>
@@ -2293,7 +2342,7 @@
                 <w:sz w:val="16"/>
                 <w:szCs w:val="16"/>
               </w:rPr>
-              <w:t>Proposta de plataforma (base S1)</w:t>
+              <w:t xml:space="preserve">Planeamento e Gantt da equipa</w:t>
             </w:r>
           </w:p>
         </w:tc>
@@ -2323,7 +2372,7 @@
                 <w:sz w:val="15"/>
                 <w:szCs w:val="15"/>
               </w:rPr>
-              <w:t>Rodrigo Silva</w:t>
+              <w:t xml:space="preserve">Em conjunto</w:t>
             </w:r>
           </w:p>
         </w:tc>
@@ -2532,21 +2581,12 @@
                 <w:szCs w:val="16"/>
               </w:rPr>
             </w:pPr>
-            <w:proofErr w:type="spellStart"/>
             <w:r>
               <w:rPr>
                 <w:sz w:val="16"/>
                 <w:szCs w:val="16"/>
               </w:rPr>
-              <w:t>Gantt</w:t>
-            </w:r>
-            <w:proofErr w:type="spellEnd"/>
-            <w:r>
-              <w:rPr>
-                <w:sz w:val="16"/>
-                <w:szCs w:val="16"/>
-              </w:rPr>
-              <w:t xml:space="preserve"> inicial e coordenação</w:t>
+              <w:t xml:space="preserve">MOOC Template: formato comum e objetivos das 5 lições</w:t>
             </w:r>
           </w:p>
         </w:tc>
@@ -2576,7 +2616,7 @@
                 <w:sz w:val="15"/>
                 <w:szCs w:val="15"/>
               </w:rPr>
-              <w:t>Bruno Lopes</w:t>
+              <w:t xml:space="preserve">Por lição + revisão cruzada</w:t>
             </w:r>
           </w:p>
         </w:tc>
@@ -2589,31 +2629,31 @@
               <w:bottom w:val="single" w:sz="4" w:space="0" w:color="BFBFBF"/>
               <w:right w:val="single" w:sz="4" w:space="0" w:color="BFBFBF"/>
             </w:tcBorders>
+            <w:tcMar>
+              <w:top w:w="15" w:type="dxa"/>
+              <w:left w:w="70" w:type="dxa"/>
+              <w:bottom w:w="15" w:type="dxa"/>
+              <w:right w:w="70" w:type="dxa"/>
+            </w:tcMar>
+            <w:vAlign w:val="center"/>
+          </w:tcPr>
+          <w:p>
+            <w:pPr>
+              <w:spacing w:line="200" w:lineRule="auto"/>
+              <w:jc w:val="center"/>
+            </w:pPr>
+          </w:p>
+        </w:tc>
+        <w:tc>
+          <w:tcPr>
+            <w:tcW w:w="682" w:type="dxa"/>
+            <w:tcBorders>
+              <w:top w:val="single" w:sz="4" w:space="0" w:color="BFBFBF"/>
+              <w:left w:val="single" w:sz="4" w:space="0" w:color="BFBFBF"/>
+              <w:bottom w:val="single" w:sz="4" w:space="0" w:color="BFBFBF"/>
+              <w:right w:val="single" w:sz="4" w:space="0" w:color="BFBFBF"/>
+            </w:tcBorders>
             <w:shd w:val="clear" w:color="auto" w:fill="9DC3E6"/>
-            <w:tcMar>
-              <w:top w:w="15" w:type="dxa"/>
-              <w:left w:w="70" w:type="dxa"/>
-              <w:bottom w:w="15" w:type="dxa"/>
-              <w:right w:w="70" w:type="dxa"/>
-            </w:tcMar>
-            <w:vAlign w:val="center"/>
-          </w:tcPr>
-          <w:p>
-            <w:pPr>
-              <w:spacing w:line="200" w:lineRule="auto"/>
-              <w:jc w:val="center"/>
-            </w:pPr>
-          </w:p>
-        </w:tc>
-        <w:tc>
-          <w:tcPr>
-            <w:tcW w:w="682" w:type="dxa"/>
-            <w:tcBorders>
-              <w:top w:val="single" w:sz="4" w:space="0" w:color="BFBFBF"/>
-              <w:left w:val="single" w:sz="4" w:space="0" w:color="BFBFBF"/>
-              <w:bottom w:val="single" w:sz="4" w:space="0" w:color="BFBFBF"/>
-              <w:right w:val="single" w:sz="4" w:space="0" w:color="BFBFBF"/>
-            </w:tcBorders>
             <w:tcMar>
               <w:top w:w="15" w:type="dxa"/>
               <w:left w:w="70" w:type="dxa"/>
@@ -2790,23 +2830,7 @@
                 <w:sz w:val="16"/>
                 <w:szCs w:val="16"/>
               </w:rPr>
-              <w:t xml:space="preserve">MOOC </w:t>
-            </w:r>
-            <w:proofErr w:type="spellStart"/>
-            <w:r>
-              <w:rPr>
-                <w:sz w:val="16"/>
-                <w:szCs w:val="16"/>
-              </w:rPr>
-              <w:t>Template</w:t>
-            </w:r>
-            <w:proofErr w:type="spellEnd"/>
-            <w:r>
-              <w:rPr>
-                <w:sz w:val="16"/>
-                <w:szCs w:val="16"/>
-              </w:rPr>
-              <w:t xml:space="preserve"> (objetivos, sequência) e coerência global</w:t>
+              <w:t xml:space="preserve">Escolha e autorização dos espaços Matterport</w:t>
             </w:r>
           </w:p>
         </w:tc>
@@ -2836,7 +2860,7 @@
                 <w:sz w:val="15"/>
                 <w:szCs w:val="15"/>
               </w:rPr>
-              <w:t>Todos; coerência: Bruno Lopes</w:t>
+              <w:t xml:space="preserve">Em conjunto</w:t>
             </w:r>
           </w:p>
         </w:tc>
@@ -3050,7 +3074,7 @@
                 <w:sz w:val="16"/>
                 <w:szCs w:val="16"/>
               </w:rPr>
-              <w:t xml:space="preserve">Escolha, autorização e captura Matterport (casa e espaço de acolhimento)</w:t>
+              <w:t xml:space="preserve">Identidade visual e modelos comuns</w:t>
             </w:r>
           </w:p>
         </w:tc>
@@ -3080,7 +3104,7 @@
                 <w:sz w:val="15"/>
                 <w:szCs w:val="15"/>
               </w:rPr>
-              <w:t>Tiago Teixeira</w:t>
+              <w:t xml:space="preserve">Em conjunto</w:t>
             </w:r>
           </w:p>
         </w:tc>
@@ -3295,7 +3319,7 @@
                 <w:sz w:val="16"/>
                 <w:szCs w:val="16"/>
               </w:rPr>
-              <w:t>Guiões e storyboards</w:t>
+              <w:t xml:space="preserve">Guiões e storyboards</w:t>
             </w:r>
           </w:p>
         </w:tc>
@@ -3325,7 +3349,7 @@
                 <w:sz w:val="15"/>
                 <w:szCs w:val="15"/>
               </w:rPr>
-              <w:t>Todos (cada um a sua lição)</w:t>
+              <w:t xml:space="preserve">Por lição + revisão cruzada</w:t>
             </w:r>
           </w:p>
         </w:tc>
@@ -3539,7 +3563,7 @@
                 <w:sz w:val="16"/>
                 <w:szCs w:val="16"/>
               </w:rPr>
-              <w:t>Identidade visual comum</w:t>
+              <w:t xml:space="preserve">Captura Matterport e tags</w:t>
             </w:r>
           </w:p>
         </w:tc>
@@ -3569,7 +3593,7 @@
                 <w:sz w:val="15"/>
                 <w:szCs w:val="15"/>
               </w:rPr>
-              <w:t>Ricardo Ferreira</w:t>
+              <w:t xml:space="preserve">Em conjunto</w:t>
             </w:r>
           </w:p>
         </w:tc>
@@ -3783,17 +3807,8 @@
                 <w:sz w:val="16"/>
                 <w:szCs w:val="16"/>
               </w:rPr>
-              <w:t xml:space="preserve">Conta de instrutor e página do curso na </w:t>
+              <w:t xml:space="preserve">Conta e página do curso na Udemy</w:t>
             </w:r>
-            <w:proofErr w:type="spellStart"/>
-            <w:r>
-              <w:rPr>
-                <w:sz w:val="16"/>
-                <w:szCs w:val="16"/>
-              </w:rPr>
-              <w:t>Udemy</w:t>
-            </w:r>
-            <w:proofErr w:type="spellEnd"/>
           </w:p>
         </w:tc>
         <w:tc>
@@ -3822,7 +3837,7 @@
                 <w:sz w:val="15"/>
                 <w:szCs w:val="15"/>
               </w:rPr>
-              <w:t>Rodrigo Silva</w:t>
+              <w:t xml:space="preserve">Em conjunto</w:t>
             </w:r>
           </w:p>
         </w:tc>
@@ -4036,7 +4051,7 @@
                 <w:sz w:val="16"/>
                 <w:szCs w:val="16"/>
               </w:rPr>
-              <w:t>Produção de media e vídeos da visita 3D</w:t>
+              <w:t xml:space="preserve">Conteúdo: vídeos das lições</w:t>
             </w:r>
           </w:p>
         </w:tc>
@@ -4066,7 +4081,7 @@
                 <w:sz w:val="15"/>
                 <w:szCs w:val="15"/>
               </w:rPr>
-              <w:t>Todos (cada um a sua lição)</w:t>
+              <w:t xml:space="preserve">Por lição + revisão cruzada</w:t>
             </w:r>
           </w:p>
         </w:tc>
@@ -4276,21 +4291,12 @@
                 <w:szCs w:val="16"/>
               </w:rPr>
             </w:pPr>
-            <w:proofErr w:type="spellStart"/>
             <w:r>
               <w:rPr>
                 <w:sz w:val="16"/>
                 <w:szCs w:val="16"/>
               </w:rPr>
-              <w:t>Quizzes</w:t>
-            </w:r>
-            <w:proofErr w:type="spellEnd"/>
-            <w:r>
-              <w:rPr>
-                <w:sz w:val="16"/>
-                <w:szCs w:val="16"/>
-              </w:rPr>
-              <w:t xml:space="preserve"> de avaliação por lição</w:t>
+              <w:t xml:space="preserve">Matterport: visita guiada e vídeo de cada lição</w:t>
             </w:r>
           </w:p>
         </w:tc>
@@ -4320,7 +4326,7 @@
                 <w:sz w:val="15"/>
                 <w:szCs w:val="15"/>
               </w:rPr>
-              <w:t>Todos (cada um a sua lição)</w:t>
+              <w:t xml:space="preserve">Por lição + revisão cruzada</w:t>
             </w:r>
           </w:p>
         </w:tc>
@@ -4534,7 +4540,7 @@
                 <w:sz w:val="16"/>
                 <w:szCs w:val="16"/>
               </w:rPr>
-              <w:t>Protótipo das lições + teste entre colegas (SUS)</w:t>
+              <w:t xml:space="preserve">Avaliação: atividades e quizzes</w:t>
             </w:r>
           </w:p>
         </w:tc>
@@ -4564,7 +4570,7 @@
                 <w:sz w:val="15"/>
                 <w:szCs w:val="15"/>
               </w:rPr>
-              <w:t>Evandro Carvalho</w:t>
+              <w:t xml:space="preserve">Por lição + revisão cruzada</w:t>
             </w:r>
           </w:p>
         </w:tc>
@@ -4778,17 +4784,8 @@
                 <w:sz w:val="16"/>
                 <w:szCs w:val="16"/>
               </w:rPr>
-              <w:t xml:space="preserve">Upload e integração das lições na </w:t>
+              <w:t xml:space="preserve">Protótipo e teste entre colegas (SUS)</w:t>
             </w:r>
-            <w:proofErr w:type="spellStart"/>
-            <w:r>
-              <w:rPr>
-                <w:sz w:val="16"/>
-                <w:szCs w:val="16"/>
-              </w:rPr>
-              <w:t>Udemy</w:t>
-            </w:r>
-            <w:proofErr w:type="spellEnd"/>
           </w:p>
         </w:tc>
         <w:tc>
@@ -4817,7 +4814,7 @@
                 <w:sz w:val="15"/>
                 <w:szCs w:val="15"/>
               </w:rPr>
-              <w:t>Rodrigo Silva</w:t>
+              <w:t xml:space="preserve">Em conjunto</w:t>
             </w:r>
           </w:p>
         </w:tc>
@@ -4902,31 +4899,31 @@
               <w:bottom w:val="single" w:sz="4" w:space="0" w:color="BFBFBF"/>
               <w:right w:val="single" w:sz="4" w:space="0" w:color="BFBFBF"/>
             </w:tcBorders>
-            <w:tcMar>
-              <w:top w:w="15" w:type="dxa"/>
-              <w:left w:w="70" w:type="dxa"/>
-              <w:bottom w:w="15" w:type="dxa"/>
-              <w:right w:w="70" w:type="dxa"/>
-            </w:tcMar>
-            <w:vAlign w:val="center"/>
-          </w:tcPr>
-          <w:p>
-            <w:pPr>
-              <w:spacing w:line="200" w:lineRule="auto"/>
-              <w:jc w:val="center"/>
-            </w:pPr>
-          </w:p>
-        </w:tc>
-        <w:tc>
-          <w:tcPr>
-            <w:tcW w:w="682" w:type="dxa"/>
-            <w:tcBorders>
-              <w:top w:val="single" w:sz="4" w:space="0" w:color="BFBFBF"/>
-              <w:left w:val="single" w:sz="4" w:space="0" w:color="BFBFBF"/>
-              <w:bottom w:val="single" w:sz="4" w:space="0" w:color="BFBFBF"/>
-              <w:right w:val="single" w:sz="4" w:space="0" w:color="BFBFBF"/>
-            </w:tcBorders>
             <w:shd w:val="clear" w:color="auto" w:fill="9DC3E6"/>
+            <w:tcMar>
+              <w:top w:w="15" w:type="dxa"/>
+              <w:left w:w="70" w:type="dxa"/>
+              <w:bottom w:w="15" w:type="dxa"/>
+              <w:right w:w="70" w:type="dxa"/>
+            </w:tcMar>
+            <w:vAlign w:val="center"/>
+          </w:tcPr>
+          <w:p>
+            <w:pPr>
+              <w:spacing w:line="200" w:lineRule="auto"/>
+              <w:jc w:val="center"/>
+            </w:pPr>
+          </w:p>
+        </w:tc>
+        <w:tc>
+          <w:tcPr>
+            <w:tcW w:w="682" w:type="dxa"/>
+            <w:tcBorders>
+              <w:top w:val="single" w:sz="4" w:space="0" w:color="BFBFBF"/>
+              <w:left w:val="single" w:sz="4" w:space="0" w:color="BFBFBF"/>
+              <w:bottom w:val="single" w:sz="4" w:space="0" w:color="BFBFBF"/>
+              <w:right w:val="single" w:sz="4" w:space="0" w:color="BFBFBF"/>
+            </w:tcBorders>
             <w:tcMar>
               <w:top w:w="15" w:type="dxa"/>
               <w:left w:w="70" w:type="dxa"/>
@@ -5031,7 +5028,7 @@
                 <w:sz w:val="16"/>
                 <w:szCs w:val="16"/>
               </w:rPr>
-              <w:t>Navegação e esquema de funcionamento</w:t>
+              <w:t xml:space="preserve">Integração na Udemy, navegação e legendas</w:t>
             </w:r>
           </w:p>
         </w:tc>
@@ -5061,7 +5058,7 @@
                 <w:sz w:val="15"/>
                 <w:szCs w:val="15"/>
               </w:rPr>
-              <w:t>Bruno Lopes</w:t>
+              <w:t xml:space="preserve">Em conjunto</w:t>
             </w:r>
           </w:p>
         </w:tc>
@@ -5275,7 +5272,7 @@
                 <w:sz w:val="16"/>
                 <w:szCs w:val="16"/>
               </w:rPr>
-              <w:t>Legendas e acessibilidade</w:t>
+              <w:t xml:space="preserve">Revisão de qualidade da Udemy</w:t>
             </w:r>
           </w:p>
         </w:tc>
@@ -5305,7 +5302,7 @@
                 <w:sz w:val="15"/>
                 <w:szCs w:val="15"/>
               </w:rPr>
-              <w:t>Ricardo Ferreira</w:t>
+              <w:t xml:space="preserve">Em conjunto</w:t>
             </w:r>
           </w:p>
         </w:tc>
@@ -5439,6 +5436,7 @@
               <w:bottom w:val="single" w:sz="4" w:space="0" w:color="BFBFBF"/>
               <w:right w:val="single" w:sz="4" w:space="0" w:color="BFBFBF"/>
             </w:tcBorders>
+            <w:shd w:val="clear" w:color="auto" w:fill="9DC3E6"/>
             <w:tcMar>
               <w:top w:w="15" w:type="dxa"/>
               <w:left w:w="70" w:type="dxa"/>
@@ -5519,17 +5517,8 @@
                 <w:sz w:val="16"/>
                 <w:szCs w:val="16"/>
               </w:rPr>
-              <w:t xml:space="preserve">Submissão para revisão de qualidade da </w:t>
+              <w:t xml:space="preserve">Testes com o público-alvo</w:t>
             </w:r>
-            <w:proofErr w:type="spellStart"/>
-            <w:r>
-              <w:rPr>
-                <w:sz w:val="16"/>
-                <w:szCs w:val="16"/>
-              </w:rPr>
-              <w:t>Udemy</w:t>
-            </w:r>
-            <w:proofErr w:type="spellEnd"/>
           </w:p>
         </w:tc>
         <w:tc>
@@ -5558,7 +5547,7 @@
                 <w:sz w:val="15"/>
                 <w:szCs w:val="15"/>
               </w:rPr>
-              <w:t>Rodrigo Silva</w:t>
+              <w:t xml:space="preserve">Em conjunto</w:t>
             </w:r>
           </w:p>
         </w:tc>
@@ -5667,7 +5656,6 @@
               <w:bottom w:val="single" w:sz="4" w:space="0" w:color="BFBFBF"/>
               <w:right w:val="single" w:sz="4" w:space="0" w:color="BFBFBF"/>
             </w:tcBorders>
-            <w:shd w:val="clear" w:color="auto" w:fill="9DC3E6"/>
             <w:tcMar>
               <w:top w:w="15" w:type="dxa"/>
               <w:left w:w="70" w:type="dxa"/>
@@ -5773,7 +5761,7 @@
                 <w:sz w:val="16"/>
                 <w:szCs w:val="16"/>
               </w:rPr>
-              <w:t>Testes com público-alvo (cuidadores)</w:t>
+              <w:t xml:space="preserve">Correções e melhorias</w:t>
             </w:r>
           </w:p>
         </w:tc>
@@ -5803,7 +5791,7 @@
                 <w:sz w:val="15"/>
                 <w:szCs w:val="15"/>
               </w:rPr>
-              <w:t>Evandro Carvalho</w:t>
+              <w:t xml:space="preserve">Em conjunto</w:t>
             </w:r>
           </w:p>
         </w:tc>
@@ -6017,7 +6005,7 @@
                 <w:sz w:val="16"/>
                 <w:szCs w:val="16"/>
               </w:rPr>
-              <w:t>Correções e melhorias</w:t>
+              <w:t xml:space="preserve">Relatório final e diretrizes da Udemy</w:t>
             </w:r>
           </w:p>
         </w:tc>
@@ -6047,7 +6035,7 @@
                 <w:sz w:val="15"/>
                 <w:szCs w:val="15"/>
               </w:rPr>
-              <w:t>Todos</w:t>
+              <w:t xml:space="preserve">Em conjunto</w:t>
             </w:r>
           </w:p>
         </w:tc>
@@ -6261,17 +6249,8 @@
                 <w:sz w:val="16"/>
                 <w:szCs w:val="16"/>
               </w:rPr>
-              <w:t xml:space="preserve">Relatório final e análise das diretrizes da </w:t>
+              <w:t xml:space="preserve">Entrega final e apresentação presencial</w:t>
             </w:r>
-            <w:proofErr w:type="spellStart"/>
-            <w:r>
-              <w:rPr>
-                <w:sz w:val="16"/>
-                <w:szCs w:val="16"/>
-              </w:rPr>
-              <w:t>Udemy</w:t>
-            </w:r>
-            <w:proofErr w:type="spellEnd"/>
           </w:p>
         </w:tc>
         <w:tc>
@@ -6300,252 +6279,7 @@
                 <w:sz w:val="15"/>
                 <w:szCs w:val="15"/>
               </w:rPr>
-              <w:t>Bruno Lopes</w:t>
-            </w:r>
-          </w:p>
-        </w:tc>
-        <w:tc>
-          <w:tcPr>
-            <w:tcW w:w="682" w:type="dxa"/>
-            <w:tcBorders>
-              <w:top w:val="single" w:sz="4" w:space="0" w:color="BFBFBF"/>
-              <w:left w:val="single" w:sz="4" w:space="0" w:color="BFBFBF"/>
-              <w:bottom w:val="single" w:sz="4" w:space="0" w:color="BFBFBF"/>
-              <w:right w:val="single" w:sz="4" w:space="0" w:color="BFBFBF"/>
-            </w:tcBorders>
-            <w:tcMar>
-              <w:top w:w="15" w:type="dxa"/>
-              <w:left w:w="70" w:type="dxa"/>
-              <w:bottom w:w="15" w:type="dxa"/>
-              <w:right w:w="70" w:type="dxa"/>
-            </w:tcMar>
-            <w:vAlign w:val="center"/>
-          </w:tcPr>
-          <w:p>
-            <w:pPr>
-              <w:spacing w:line="200" w:lineRule="auto"/>
-              <w:jc w:val="center"/>
-            </w:pPr>
-          </w:p>
-        </w:tc>
-        <w:tc>
-          <w:tcPr>
-            <w:tcW w:w="682" w:type="dxa"/>
-            <w:tcBorders>
-              <w:top w:val="single" w:sz="4" w:space="0" w:color="BFBFBF"/>
-              <w:left w:val="single" w:sz="4" w:space="0" w:color="BFBFBF"/>
-              <w:bottom w:val="single" w:sz="4" w:space="0" w:color="BFBFBF"/>
-              <w:right w:val="single" w:sz="4" w:space="0" w:color="BFBFBF"/>
-            </w:tcBorders>
-            <w:tcMar>
-              <w:top w:w="15" w:type="dxa"/>
-              <w:left w:w="70" w:type="dxa"/>
-              <w:bottom w:w="15" w:type="dxa"/>
-              <w:right w:w="70" w:type="dxa"/>
-            </w:tcMar>
-            <w:vAlign w:val="center"/>
-          </w:tcPr>
-          <w:p>
-            <w:pPr>
-              <w:spacing w:line="200" w:lineRule="auto"/>
-              <w:jc w:val="center"/>
-            </w:pPr>
-          </w:p>
-        </w:tc>
-        <w:tc>
-          <w:tcPr>
-            <w:tcW w:w="682" w:type="dxa"/>
-            <w:tcBorders>
-              <w:top w:val="single" w:sz="4" w:space="0" w:color="BFBFBF"/>
-              <w:left w:val="single" w:sz="4" w:space="0" w:color="BFBFBF"/>
-              <w:bottom w:val="single" w:sz="4" w:space="0" w:color="BFBFBF"/>
-              <w:right w:val="single" w:sz="4" w:space="0" w:color="BFBFBF"/>
-            </w:tcBorders>
-            <w:tcMar>
-              <w:top w:w="15" w:type="dxa"/>
-              <w:left w:w="70" w:type="dxa"/>
-              <w:bottom w:w="15" w:type="dxa"/>
-              <w:right w:w="70" w:type="dxa"/>
-            </w:tcMar>
-            <w:vAlign w:val="center"/>
-          </w:tcPr>
-          <w:p>
-            <w:pPr>
-              <w:spacing w:line="200" w:lineRule="auto"/>
-              <w:jc w:val="center"/>
-            </w:pPr>
-          </w:p>
-        </w:tc>
-        <w:tc>
-          <w:tcPr>
-            <w:tcW w:w="682" w:type="dxa"/>
-            <w:tcBorders>
-              <w:top w:val="single" w:sz="4" w:space="0" w:color="BFBFBF"/>
-              <w:left w:val="single" w:sz="4" w:space="0" w:color="BFBFBF"/>
-              <w:bottom w:val="single" w:sz="4" w:space="0" w:color="BFBFBF"/>
-              <w:right w:val="single" w:sz="4" w:space="0" w:color="BFBFBF"/>
-            </w:tcBorders>
-            <w:tcMar>
-              <w:top w:w="15" w:type="dxa"/>
-              <w:left w:w="70" w:type="dxa"/>
-              <w:bottom w:w="15" w:type="dxa"/>
-              <w:right w:w="70" w:type="dxa"/>
-            </w:tcMar>
-            <w:vAlign w:val="center"/>
-          </w:tcPr>
-          <w:p>
-            <w:pPr>
-              <w:spacing w:line="200" w:lineRule="auto"/>
-              <w:jc w:val="center"/>
-            </w:pPr>
-          </w:p>
-        </w:tc>
-        <w:tc>
-          <w:tcPr>
-            <w:tcW w:w="682" w:type="dxa"/>
-            <w:tcBorders>
-              <w:top w:val="single" w:sz="4" w:space="0" w:color="BFBFBF"/>
-              <w:left w:val="single" w:sz="4" w:space="0" w:color="BFBFBF"/>
-              <w:bottom w:val="single" w:sz="4" w:space="0" w:color="BFBFBF"/>
-              <w:right w:val="single" w:sz="4" w:space="0" w:color="BFBFBF"/>
-            </w:tcBorders>
-            <w:shd w:val="clear" w:color="auto" w:fill="9DC3E6"/>
-            <w:tcMar>
-              <w:top w:w="15" w:type="dxa"/>
-              <w:left w:w="70" w:type="dxa"/>
-              <w:bottom w:w="15" w:type="dxa"/>
-              <w:right w:w="70" w:type="dxa"/>
-            </w:tcMar>
-            <w:vAlign w:val="center"/>
-          </w:tcPr>
-          <w:p>
-            <w:pPr>
-              <w:spacing w:line="200" w:lineRule="auto"/>
-              <w:jc w:val="center"/>
-            </w:pPr>
-          </w:p>
-        </w:tc>
-        <w:tc>
-          <w:tcPr>
-            <w:tcW w:w="682" w:type="dxa"/>
-            <w:tcBorders>
-              <w:top w:val="single" w:sz="4" w:space="0" w:color="BFBFBF"/>
-              <w:left w:val="single" w:sz="4" w:space="0" w:color="BFBFBF"/>
-              <w:bottom w:val="single" w:sz="4" w:space="0" w:color="BFBFBF"/>
-              <w:right w:val="single" w:sz="4" w:space="0" w:color="BFBFBF"/>
-            </w:tcBorders>
-            <w:shd w:val="clear" w:color="auto" w:fill="9DC3E6"/>
-            <w:tcMar>
-              <w:top w:w="15" w:type="dxa"/>
-              <w:left w:w="70" w:type="dxa"/>
-              <w:bottom w:w="15" w:type="dxa"/>
-              <w:right w:w="70" w:type="dxa"/>
-            </w:tcMar>
-            <w:vAlign w:val="center"/>
-          </w:tcPr>
-          <w:p>
-            <w:pPr>
-              <w:spacing w:line="200" w:lineRule="auto"/>
-              <w:jc w:val="center"/>
-            </w:pPr>
-          </w:p>
-        </w:tc>
-        <w:tc>
-          <w:tcPr>
-            <w:tcW w:w="786" w:type="dxa"/>
-            <w:tcBorders>
-              <w:top w:val="single" w:sz="4" w:space="0" w:color="BFBFBF"/>
-              <w:left w:val="single" w:sz="4" w:space="0" w:color="BFBFBF"/>
-              <w:bottom w:val="single" w:sz="4" w:space="0" w:color="BFBFBF"/>
-              <w:right w:val="single" w:sz="4" w:space="0" w:color="BFBFBF"/>
-            </w:tcBorders>
-            <w:tcMar>
-              <w:top w:w="15" w:type="dxa"/>
-              <w:left w:w="70" w:type="dxa"/>
-              <w:bottom w:w="15" w:type="dxa"/>
-              <w:right w:w="70" w:type="dxa"/>
-            </w:tcMar>
-            <w:vAlign w:val="center"/>
-          </w:tcPr>
-          <w:p>
-            <w:pPr>
-              <w:spacing w:line="200" w:lineRule="auto"/>
-              <w:jc w:val="center"/>
-            </w:pPr>
-          </w:p>
-        </w:tc>
-      </w:tr>
-      <w:tr>
-        <w:tblPrEx>
-          <w:tblCellMar>
-            <w:top w:w="0" w:type="dxa"/>
-            <w:bottom w:w="0" w:type="dxa"/>
-          </w:tblCellMar>
-        </w:tblPrEx>
-        <w:trPr>
-          <w:cantSplit/>
-        </w:trPr>
-        <w:tc>
-          <w:tcPr>
-            <w:tcW w:w="3250" w:type="dxa"/>
-            <w:tcBorders>
-              <w:top w:val="single" w:sz="4" w:space="0" w:color="BFBFBF"/>
-              <w:left w:val="single" w:sz="4" w:space="0" w:color="BFBFBF"/>
-              <w:bottom w:val="single" w:sz="4" w:space="0" w:color="BFBFBF"/>
-              <w:right w:val="single" w:sz="4" w:space="0" w:color="BFBFBF"/>
-            </w:tcBorders>
-            <w:tcMar>
-              <w:top w:w="15" w:type="dxa"/>
-              <w:left w:w="70" w:type="dxa"/>
-              <w:bottom w:w="15" w:type="dxa"/>
-              <w:right w:w="70" w:type="dxa"/>
-            </w:tcMar>
-            <w:vAlign w:val="center"/>
-          </w:tcPr>
-          <w:p>
-            <w:pPr>
-              <w:spacing w:line="200" w:lineRule="auto"/>
-              <w:rPr>
-                <w:sz w:val="16"/>
-                <w:szCs w:val="16"/>
-              </w:rPr>
-            </w:pPr>
-            <w:r>
-              <w:rPr>
-                <w:sz w:val="16"/>
-                <w:szCs w:val="16"/>
-              </w:rPr>
-              <w:t>Entrega final e apresentação presencial</w:t>
-            </w:r>
-          </w:p>
-        </w:tc>
-        <w:tc>
-          <w:tcPr>
-            <w:tcW w:w="1850" w:type="dxa"/>
-            <w:tcBorders>
-              <w:top w:val="single" w:sz="4" w:space="0" w:color="BFBFBF"/>
-              <w:left w:val="single" w:sz="4" w:space="0" w:color="BFBFBF"/>
-              <w:bottom w:val="single" w:sz="4" w:space="0" w:color="BFBFBF"/>
-              <w:right w:val="single" w:sz="4" w:space="0" w:color="BFBFBF"/>
-            </w:tcBorders>
-            <w:tcMar>
-              <w:top w:w="15" w:type="dxa"/>
-              <w:left w:w="70" w:type="dxa"/>
-              <w:bottom w:w="15" w:type="dxa"/>
-              <w:right w:w="70" w:type="dxa"/>
-            </w:tcMar>
-            <w:vAlign w:val="center"/>
-          </w:tcPr>
-          <w:p>
-            <w:pPr>
-              <w:spacing w:line="200" w:lineRule="auto"/>
-            </w:pPr>
-            <w:r>
-              <w:rPr>
-                <w:sz w:val="15"/>
-                <w:szCs w:val="15"/>
-              </w:rPr>
-              <w:t>Todos</w:t>
+              <w:t xml:space="preserve">Em conjunto</w:t>
             </w:r>
           </w:p>
         </w:tc>

</xml_diff>

<commit_message>
Adicionado Estado da Arte aos documentos
</commit_message>
<xml_diff>
--- a/Files/P1/S2_MOOC-choice_planning_Grupo1.docx
+++ b/Files/P1/S2_MOOC-choice_planning_Grupo1.docx
@@ -87,7 +87,7 @@
           <w:sz w:val="22"/>
           <w:szCs w:val="22"/>
         </w:rPr>
-        <w:t xml:space="preserve">Cuidar em Crise — Primeiros socorros psicológicos para cuidadores de pessoas com demência</w:t>
+        <w:t>Cuidar em Crise — Primeiros socorros psicológicos para cuidadores de pessoas com demência</w:t>
       </w:r>
     </w:p>
     <w:p>
@@ -191,7 +191,7 @@
           <w:sz w:val="20"/>
           <w:szCs w:val="20"/>
         </w:rPr>
-        <w:t xml:space="preserve">«Cuidar em Crise — Primeiros socorros psicológicos para cuidadores de pessoas com demência».</w:t>
+        <w:t>«Cuidar em Crise — Primeiros socorros psicológicos para cuidadores de pessoas com demência».</w:t>
       </w:r>
     </w:p>
     <w:p>
@@ -216,7 +216,7 @@
           <w:sz w:val="20"/>
           <w:szCs w:val="20"/>
         </w:rPr>
-        <w:t xml:space="preserve">Acolher (crise e apoio psicossocial), com ligação a Incluir (demência) e Capacitar (bem-estar e autonomia de quem cuida). Foco: acalmar e estabelecer contacto respeitoso com a pessoa com demência, reconhecer e responder às necessidades imediatas de ambos, cuidar do próprio equilíbrio emocional e identificar quando procurar ajuda especializada.</w:t>
+        <w:t>Acolher (crise e apoio psicossocial), com ligação a Incluir (demência) e Capacitar (bem-estar e autonomia de quem cuida). Foco: acalmar e estabelecer contacto respeitoso com a pessoa com demência, reconhecer e responder às necessidades imediatas de ambos, cuidar do próprio equilíbrio emocional e identificar quando procurar ajuda especializada.</w:t>
       </w:r>
     </w:p>
     <w:p>
@@ -232,7 +232,7 @@
           <w:sz w:val="20"/>
           <w:szCs w:val="20"/>
         </w:rPr>
-        <w:t xml:space="preserve">Portugal está entre os países mais afetados pela demência: cerca de 182 500 pessoas (</w:t>
+        <w:t>Portugal está entre os países mais afetados pela demência: cerca de 182 500 pessoas (</w:t>
       </w:r>
       <w:hyperlink r:id="rId7" w:history="1">
         <w:r>
@@ -242,7 +242,7 @@
             <w:szCs w:val="20"/>
             <w:u w:val="single"/>
           </w:rPr>
-          <w:t xml:space="preserve">Alzheimer Portugal</w:t>
+          <w:t>Alzheimer Portugal</w:t>
         </w:r>
       </w:hyperlink>
       <w:r>
@@ -250,7 +250,7 @@
           <w:sz w:val="20"/>
           <w:szCs w:val="20"/>
         </w:rPr>
-        <w:t xml:space="preserve">), 4.º lugar da OCDE em casos por 1000 habitantes (19,9, média 14,8) e uma projeção de ≈ 322 000 casos em 2037 (</w:t>
+        <w:t>), 4.º lugar da OCDE em casos por 1000 habitantes (19,9, média 14,8) e uma projeção de ≈ 322 000 casos em 2037 (</w:t>
       </w:r>
       <w:hyperlink r:id="rId8" w:history="1">
         <w:r>
@@ -260,7 +260,7 @@
             <w:szCs w:val="20"/>
             <w:u w:val="single"/>
           </w:rPr>
-          <w:t xml:space="preserve">OCDE 2017, via Alzheimer Portugal</w:t>
+          <w:t>OCDE 2017, via Alzheimer Portugal</w:t>
         </w:r>
       </w:hyperlink>
       <w:r>
@@ -268,7 +268,7 @@
           <w:sz w:val="20"/>
           <w:szCs w:val="20"/>
         </w:rPr>
-        <w:t xml:space="preserve">). Muitas pessoas vivem em casa com um familiar sem formação: dos 18 149 cuidadores com Estatuto reconhecido (Lei n.º 100/2019), 84% são mulheres (idade média 57) e 60,5% dos avaliados estão em sobrecarga (</w:t>
+        <w:t>). Muitas pessoas vivem em casa com um familiar sem formação: dos 18 149 cuidadores com Estatuto reconhecido (Lei n.º 100/2019), 84% são mulheres (idade média 57) e 60,5% dos avaliados estão em sobrecarga (</w:t>
       </w:r>
       <w:hyperlink r:id="rId9" w:history="1">
         <w:r>
@@ -278,7 +278,7 @@
             <w:szCs w:val="20"/>
             <w:u w:val="single"/>
           </w:rPr>
-          <w:t xml:space="preserve">ISS, out. 2025</w:t>
+          <w:t>ISS, out. 2025</w:t>
         </w:r>
       </w:hyperlink>
       <w:r>
@@ -286,7 +286,7 @@
           <w:sz w:val="20"/>
           <w:szCs w:val="20"/>
         </w:rPr>
-        <w:t xml:space="preserve">). Numa crise (incêndio, cheia ou tempestade, pandemia, deslocação por conflito) a pessoa com demência perde a rotina e as referências e reage com medo, confusão ou agitação, e o cuidador, já sobrecarregado, fica sem a sua rede de apoio (ADI, 2019, «Forgotten in a Crisis»). Falta uma formação curta, gratuita e em português que prepare a dupla para esse momento.</w:t>
+        <w:t>). Numa crise (incêndio, cheia ou tempestade, pandemia, deslocação por conflito) a pessoa com demência perde a rotina e as referências e reage com medo, confusão ou agitação, e o cuidador, já sobrecarregado, fica sem a sua rede de apoio (ADI, 2019, «Forgotten in a Crisis»). Falta uma formação curta, gratuita e em português que prepare a dupla para esse momento.</w:t>
       </w:r>
     </w:p>
     <w:p>
@@ -343,7 +343,7 @@
           <w:sz w:val="20"/>
           <w:szCs w:val="20"/>
         </w:rPr>
-        <w:t xml:space="preserve">como acalmar, o que atender primeiro, ficar ou sair, quando e a quem pedir ajuda, para a pessoa e para si.</w:t>
+        <w:t>como acalmar, o que atender primeiro, ficar ou sair, quando e a quem pedir ajuda, para a pessoa e para si.</w:t>
       </w:r>
     </w:p>
     <w:p>
@@ -368,7 +368,7 @@
           <w:sz w:val="20"/>
           <w:szCs w:val="20"/>
         </w:rPr>
-        <w:t xml:space="preserve">o que acalma ou perturba a pessoa está no espaço (ruído, luzes, objetos familiares, saídas), e fora de casa o espaço de acolhimento é desconhecido. No Matterport o cuidador treina o olhar e as decisões sem estar em crise: a casa da dupla fictícia D. Rosa e Ana, capturada pelo grupo (preparar, acalmar, retomar), e um espaço de acolhimento encenado numa sala da escola (sair, pedir ajuda; plano B: Matterport Discover). Tags azuis para a pessoa e laranja para o cuidador; consentimento do proprietário e sem dados pessoais.</w:t>
+        <w:t>o que acalma ou perturba a pessoa está no espaço (ruído, luzes, objetos familiares, saídas), e fora de casa o espaço de acolhimento é desconhecido. No Matterport o cuidador treina o olhar e as decisões sem estar em crise: a casa da dupla fictícia D. Rosa e Ana, capturada pelo grupo (preparar, acalmar, retomar), e um espaço de acolhimento encenado numa sala da escola (sair, pedir ajuda; plano B: Matterport Discover). Tags azuis para a pessoa e laranja para o cuidador; consentimento do proprietário e sem dados pessoais.</w:t>
       </w:r>
     </w:p>
     <w:p>
@@ -431,12 +431,6 @@
         <w:gridCol w:w="7478"/>
       </w:tblGrid>
       <w:tr>
-        <w:tblPrEx>
-          <w:tblCellMar>
-            <w:top w:w="0" w:type="dxa"/>
-            <w:bottom w:w="0" w:type="dxa"/>
-          </w:tblCellMar>
-        </w:tblPrEx>
         <w:trPr>
           <w:tblHeader/>
         </w:trPr>
@@ -518,12 +512,6 @@
         </w:tc>
       </w:tr>
       <w:tr>
-        <w:tblPrEx>
-          <w:tblCellMar>
-            <w:top w:w="0" w:type="dxa"/>
-            <w:bottom w:w="0" w:type="dxa"/>
-          </w:tblCellMar>
-        </w:tblPrEx>
         <w:tc>
           <w:tcPr>
             <w:tcW w:w="2500" w:type="dxa"/>
@@ -591,18 +579,12 @@
                 <w:sz w:val="18"/>
                 <w:szCs w:val="18"/>
               </w:rPr>
-              <w:t xml:space="preserve">Acolher (resposta em crise e espaços de acolhimento), a nossa porta principal; com Incluir (demência) e Capacitar (bem-estar e autonomia de quem cuida).</w:t>
+              <w:t>Acolher (resposta em crise e espaços de acolhimento), a nossa porta principal; com Incluir (demência) e Capacitar (bem-estar e autonomia de quem cuida).</w:t>
             </w:r>
           </w:p>
         </w:tc>
       </w:tr>
       <w:tr>
-        <w:tblPrEx>
-          <w:tblCellMar>
-            <w:top w:w="0" w:type="dxa"/>
-            <w:bottom w:w="0" w:type="dxa"/>
-          </w:tblCellMar>
-        </w:tblPrEx>
         <w:tc>
           <w:tcPr>
             <w:tcW w:w="2500" w:type="dxa"/>
@@ -670,18 +652,12 @@
                 <w:sz w:val="18"/>
                 <w:szCs w:val="18"/>
               </w:rPr>
-              <w:t xml:space="preserve">Partimos dos desafios «Crise e apoio psicossocial» (PSP em crises e catástrofes) e «Acolhimento em crise» (acolhimento, apoio e encaminhamento); ligam-se a «Saúde mental na comunidade» (sinais de alerta e onde procurar ajuda, para a pessoa e para o cuidador) e a «Literacia em saúde» (navegar nos serviços e nos apoios).</w:t>
+              <w:t>Partimos dos desafios «Crise e apoio psicossocial» (PSP em crises e catástrofes) e «Acolhimento em crise» (acolhimento, apoio e encaminhamento); ligam-se a «Saúde mental na comunidade» (sinais de alerta e onde procurar ajuda, para a pessoa e para o cuidador) e a «Literacia em saúde» (navegar nos serviços e nos apoios).</w:t>
             </w:r>
           </w:p>
         </w:tc>
       </w:tr>
       <w:tr>
-        <w:tblPrEx>
-          <w:tblCellMar>
-            <w:top w:w="0" w:type="dxa"/>
-            <w:bottom w:w="0" w:type="dxa"/>
-          </w:tblCellMar>
-        </w:tblPrEx>
         <w:tc>
           <w:tcPr>
             <w:tcW w:w="2500" w:type="dxa"/>
@@ -749,18 +725,12 @@
                 <w:sz w:val="18"/>
                 <w:szCs w:val="18"/>
               </w:rPr>
-              <w:t xml:space="preserve">Comunidade: famílias que cuidam de uma pessoa com demência em casa → Necessidade: atravessar uma crise sem que a pessoa entre em angústia nem o cuidador se esgote → Pessoas: cuidadores informais → Aprendizagem: prática e situada, treinada antes da crise → Solução digital: curso curto no telemóvel com um espaço real em 3D → MOOC.</w:t>
+              <w:t>Comunidade: famílias que cuidam de uma pessoa com demência em casa → Necessidade: atravessar uma crise sem que a pessoa entre em angústia nem o cuidador se esgote → Pessoas: cuidadores informais → Aprendizagem: prática e situada, treinada antes da crise → Solução digital: curso curto no telemóvel com um espaço real em 3D → MOOC.</w:t>
             </w:r>
           </w:p>
         </w:tc>
       </w:tr>
       <w:tr>
-        <w:tblPrEx>
-          <w:tblCellMar>
-            <w:top w:w="0" w:type="dxa"/>
-            <w:bottom w:w="0" w:type="dxa"/>
-          </w:tblCellMar>
-        </w:tblPrEx>
         <w:tc>
           <w:tcPr>
             <w:tcW w:w="2500" w:type="dxa"/>
@@ -828,7 +798,7 @@
                 <w:sz w:val="18"/>
                 <w:szCs w:val="18"/>
               </w:rPr>
-              <w:t xml:space="preserve">Observar e Escolher: os dados acima e o foco em crise (Aula 3); Compreender: perfil do cuidador (secção 3); Imaginar: o que o cuidador deve saber decidir (secções 1 e 4); Transformar: 5 lições em vídeo + visita 3D (secções 4 e 5, detalhe no MOOC Template da S3).</w:t>
+              <w:t>Observar e Escolher: os dados acima e o foco em crise (Aula 3); Compreender: perfil do cuidador (secção 3); Imaginar: o que o cuidador deve saber decidir (secções 1 e 5); Transformar: 5 lições em vídeo + visita 3D (secções 5 e 6, detalhe no MOOC Template da S3).</w:t>
             </w:r>
           </w:p>
         </w:tc>
@@ -892,7 +862,7 @@
           <w:sz w:val="20"/>
           <w:szCs w:val="20"/>
         </w:rPr>
-        <w:t xml:space="preserve">voluntários e técnicos de apoio domiciliário ou de espaços de acolhimento que procuram uma introdução prática.</w:t>
+        <w:t>voluntários e técnicos de apoio domiciliário ou de espaços de acolhimento que procuram uma introdução prática.</w:t>
       </w:r>
     </w:p>
     <w:p>
@@ -917,17 +887,13 @@
           <w:sz w:val="20"/>
           <w:szCs w:val="20"/>
         </w:rPr>
-        <w:t xml:space="preserve">linguagem simples, texto grande e bom contraste (público sobretudo feminino, ≈ 57 anos); lições curtas de ≈ 8 min (pouco tempo, risco de sobrecarga); vídeo como formato principal e acesso no telemóvel (literacia digital variável); exemplos do dia a dia em vez de linguagem clínica; legendas e materiais descarregáveis (ficha da pessoa, checklist do kit, cartão de bolso); visita 3D curta (4 a 6 paragens), com instruções de navegação e sempre opcional.</w:t>
+        <w:t>linguagem simples, texto grande e bom contraste (público sobretudo feminino, ≈ 57 anos); lições curtas de ≈ 8 min (pouco tempo, risco de sobrecarga); vídeo como formato principal e acesso no telemóvel (literacia digital variável); exemplos do dia a dia em vez de linguagem clínica; legendas e materiais descarregáveis (ficha da pessoa, checklist do kit, cartão de bolso); visita 3D curta (4 a 6 paragens), com instruções de navegação e sempre opcional.</w:t>
       </w:r>
     </w:p>
     <w:p>
       <w:pPr>
         <w:keepNext/>
         <w:spacing w:before="110" w:after="50"/>
-        <w:rPr>
-          <w:sz w:val="20"/>
-          <w:szCs w:val="20"/>
-        </w:rPr>
       </w:pPr>
       <w:r>
         <w:rPr>
@@ -937,23 +903,7 @@
           <w:sz w:val="24"/>
           <w:szCs w:val="24"/>
         </w:rPr>
-        <w:t>4. Objetivo geral do MOOC</w:t>
-      </w:r>
-    </w:p>
-    <w:p>
-      <w:pPr>
-        <w:spacing w:after="40" w:line="250" w:lineRule="auto"/>
-        <w:rPr>
-          <w:sz w:val="20"/>
-          <w:szCs w:val="20"/>
-        </w:rPr>
-      </w:pPr>
-      <w:r>
-        <w:rPr>
-          <w:sz w:val="20"/>
-          <w:szCs w:val="20"/>
-        </w:rPr>
-        <w:t xml:space="preserve">No fim do curso, o cuidador é capaz de se preparar para uma situação de crise e de prestar primeiros socorros psicológicos à pessoa com demência e a si próprio: acalmar, responder às necessidades imediatas, manter a rotina possível e reconhecer quando procurar ajuda especializada.</w:t>
+        <w:t>4. Estado da arte: o que já existe</w:t>
       </w:r>
     </w:p>
     <w:p>
@@ -966,255 +916,27 @@
       </w:pPr>
       <w:r>
         <w:rPr>
+          <w:sz w:val="20"/>
+          <w:szCs w:val="20"/>
+        </w:rPr>
+        <w:t xml:space="preserve">Já existem cursos sobre demência e cuidadores, mas são extensos (23 sessões, 14 h a 51 h), gerais e centrados no dia a dia. Cada um tem algo de único: o iSupport da OMS tem manual impresso e mensagens SMS para quem tem pouca literacia digital; o NAU junta vídeos, quizzes e manual de apoio; o curso da Santa </w:t>
+      </w:r>
+      <w:r>
+        <w:rPr>
+          <w:sz w:val="20"/>
+          <w:szCs w:val="20"/>
+        </w:rPr>
+        <w:lastRenderedPageBreak/>
+        <w:t xml:space="preserve">Maria é síncrono, por videoconferência; o da Tasmânia inclui testemunhos de pessoas com demência. Nas páginas consultadas, nenhum trata a crise nem os primeiros socorros psicológicos à dupla cuidador–pessoa com demência, nem oferece prática num espaço 3D. O nosso diferencia-se por ser curto (≈ 40 min, no telemóvel), gratuito, em português, focado na crise (antes, durante e depois) e com prática na visita 3D; completa estes cursos, para onde a L5 pode encaminhar. </w:t>
+      </w:r>
+      <w:r>
+        <w:rPr>
           <w:b/>
           <w:bCs/>
           <w:sz w:val="20"/>
           <w:szCs w:val="20"/>
         </w:rPr>
-        <w:t xml:space="preserve">Diferenciação: </w:t>
-      </w:r>
-      <w:r>
-        <w:rPr>
-          <w:sz w:val="20"/>
-          <w:szCs w:val="20"/>
-        </w:rPr>
-        <w:t xml:space="preserve">os cursos de primeiros socorros psicológicos (ex.: Johns Hopkins, Coursera) são gerais e em inglês; os cursos portugueses para cuidadores (NAU/ESEP, iSupport-Portugal) tratam o dia a dia e não a crise. O nosso é curto (≈ 40 min), gratuito, em português e aplica os PSP à dupla cuidador–pessoa com demência, com prática num espaço real em 3D.</w:t>
-      </w:r>
-    </w:p>
-    <w:p>
-      <w:pPr>
-        <w:spacing w:after="60" w:line="250" w:lineRule="auto"/>
-        <w:rPr>
-          <w:sz w:val="20"/>
-          <w:szCs w:val="20"/>
-        </w:rPr>
-      </w:pPr>
-      <w:r>
-        <w:rPr>
-          <w:b/>
-          <w:bCs/>
-          <w:sz w:val="20"/>
-          <w:szCs w:val="20"/>
-        </w:rPr>
-        <w:t xml:space="preserve">Estrutura: </w:t>
-      </w:r>
-      <w:r>
-        <w:rPr>
-          <w:sz w:val="20"/>
-          <w:szCs w:val="20"/>
-        </w:rPr>
-        <w:t xml:space="preserve">5 lições de ≈ 8 min (uma por elemento), em sequência temporal; cada lição tem uma componente para a pessoa e outra para o cuidador.</w:t>
-      </w:r>
-    </w:p>
-    <w:p>
-      <w:pPr>
-        <w:spacing w:after="60" w:line="250" w:lineRule="auto"/>
-        <w:rPr>
-          <w:sz w:val="20"/>
-          <w:szCs w:val="20"/>
-        </w:rPr>
-      </w:pPr>
-      <w:r>
-        <w:rPr>
-          <w:b/>
-          <w:bCs/>
-          <w:sz w:val="20"/>
-          <w:szCs w:val="20"/>
-        </w:rPr>
-        <w:t xml:space="preserve">L1 Crise, demência e quem cuida (Compreender, Bruno): </w:t>
-      </w:r>
-      <w:r>
-        <w:rPr>
-          <w:sz w:val="20"/>
-          <w:szCs w:val="20"/>
-        </w:rPr>
-        <w:t xml:space="preserve">como a crise agrava a confusão, o medo e a agitação; reações normais ao stress; introdução aos PSP (observar, escutar, encaminhar).</w:t>
-      </w:r>
-    </w:p>
-    <w:p>
-      <w:pPr>
-        <w:spacing w:after="60" w:line="250" w:lineRule="auto"/>
-        <w:rPr>
-          <w:sz w:val="20"/>
-          <w:szCs w:val="20"/>
-        </w:rPr>
-      </w:pPr>
-      <w:r>
-        <w:rPr>
-          <w:b/>
-          <w:bCs/>
-          <w:sz w:val="20"/>
-          <w:szCs w:val="20"/>
-        </w:rPr>
-        <w:t xml:space="preserve">L2 Preparar antes (Antes, Tiago): </w:t>
-      </w:r>
-      <w:r>
-        <w:rPr>
-          <w:sz w:val="20"/>
-          <w:szCs w:val="20"/>
-        </w:rPr>
-        <w:t xml:space="preserve">kit com objetos de conforto e «ficha da pessoa» (o que a acalma e o que a perturba); plano de apoio: rede de contactos e quem substitui o cuidador.</w:t>
-      </w:r>
-    </w:p>
-    <w:p>
-      <w:pPr>
-        <w:spacing w:after="60" w:line="250" w:lineRule="auto"/>
-        <w:rPr>
-          <w:sz w:val="20"/>
-          <w:szCs w:val="20"/>
-        </w:rPr>
-      </w:pPr>
-      <w:r>
-        <w:rPr>
-          <w:b/>
-          <w:bCs/>
-          <w:sz w:val="20"/>
-          <w:szCs w:val="20"/>
-        </w:rPr>
-        <w:t xml:space="preserve">L3 Primeiro contacto: acalmar (Durante, Rodrigo): </w:t>
-      </w:r>
-      <w:r>
-        <w:rPr>
-          <w:sz w:val="20"/>
-          <w:szCs w:val="20"/>
-        </w:rPr>
-        <w:t xml:space="preserve">observar sinais de angústia, aproximação calma, frases curtas, validar, reduzir estímulos; acalmar-se para acalmar (autorregulação rápida).</w:t>
-      </w:r>
-    </w:p>
-    <w:p>
-      <w:pPr>
-        <w:spacing w:after="60" w:line="250" w:lineRule="auto"/>
-        <w:rPr>
-          <w:sz w:val="20"/>
-          <w:szCs w:val="20"/>
-        </w:rPr>
-      </w:pPr>
-      <w:r>
-        <w:rPr>
-          <w:b/>
-          <w:bCs/>
-          <w:sz w:val="20"/>
-          <w:szCs w:val="20"/>
-        </w:rPr>
-        <w:t xml:space="preserve">L4 Necessidades e encaminhamento (Durante, em casa ou fora, Ricardo): </w:t>
-      </w:r>
-      <w:r>
-        <w:rPr>
-          <w:sz w:val="20"/>
-          <w:szCs w:val="20"/>
-        </w:rPr>
-        <w:t xml:space="preserve">necessidades básicas, medicação, sinalizar a demência às equipas, sinais de alarme; dizer o que precisa, aceitar ajuda, reconhecer limites.</w:t>
-      </w:r>
-    </w:p>
-    <w:p>
-      <w:pPr>
-        <w:spacing w:after="60" w:line="250" w:lineRule="auto"/>
-        <w:rPr>
-          <w:sz w:val="20"/>
-          <w:szCs w:val="20"/>
-        </w:rPr>
-      </w:pPr>
-      <w:r>
-        <w:rPr>
-          <w:b/>
-          <w:bCs/>
-          <w:sz w:val="20"/>
-          <w:szCs w:val="20"/>
-        </w:rPr>
-        <w:t xml:space="preserve">L5 Depois da crise (Depois, Evandro): </w:t>
-      </w:r>
-      <w:r>
-        <w:rPr>
-          <w:sz w:val="20"/>
-          <w:szCs w:val="20"/>
-        </w:rPr>
-        <w:t xml:space="preserve">retomar a rotina; vigiar mudanças nas semanas seguintes; sinais de sofrimento prolongado; onde pedir apoio psicológico.</w:t>
-      </w:r>
-    </w:p>
-    <w:p>
-      <w:pPr>
-        <w:keepNext/>
-        <w:spacing w:before="110" w:after="50"/>
-        <w:rPr>
-          <w:sz w:val="20"/>
-          <w:szCs w:val="20"/>
-        </w:rPr>
-      </w:pPr>
-      <w:r>
-        <w:rPr>
-          <w:b/>
-          <w:bCs/>
-          <w:color w:val="1F4E79"/>
-          <w:sz w:val="24"/>
-          <w:szCs w:val="24"/>
-        </w:rPr>
-        <w:t>5. Proposta inicial de plataforma</w:t>
-      </w:r>
-    </w:p>
-    <w:p>
-      <w:pPr>
-        <w:spacing w:after="60" w:line="250" w:lineRule="auto"/>
-        <w:rPr>
-          <w:sz w:val="20"/>
-          <w:szCs w:val="20"/>
-        </w:rPr>
-      </w:pPr>
-      <w:r>
-        <w:rPr>
-          <w:b/>
-          <w:bCs/>
-          <w:sz w:val="20"/>
-          <w:szCs w:val="20"/>
-        </w:rPr>
-        <w:t xml:space="preserve">Udemy. </w:t>
-      </w:r>
-      <w:r>
-        <w:rPr>
-          <w:sz w:val="20"/>
-          <w:szCs w:val="20"/>
-        </w:rPr>
-        <w:t xml:space="preserve">Das três candidatas da S1 (Moodle, Open edX, Udemy) é a única com acesso aberto e massivo sem servidor; o vídeo serve lições de 8 min e tem quizzes nativos. O Moodle exige alojamento e o Open edX uma instalação pesada para o prazo; Coursera, edX.org, FutureLearn e MiríadaX só aceitam parceiros.</w:t>
-      </w:r>
-    </w:p>
-    <w:p>
-      <w:pPr>
-        <w:spacing w:after="60" w:line="250" w:lineRule="auto"/>
-        <w:rPr>
-          <w:sz w:val="20"/>
-          <w:szCs w:val="20"/>
-        </w:rPr>
-      </w:pPr>
-      <w:r>
-        <w:rPr>
-          <w:b/>
-          <w:bCs/>
-          <w:sz w:val="20"/>
-          <w:szCs w:val="20"/>
-        </w:rPr>
-        <w:t xml:space="preserve">Regras da Udemy e como as cumprimos: </w:t>
-      </w:r>
-      <w:r>
-        <w:rPr>
-          <w:sz w:val="20"/>
-          <w:szCs w:val="20"/>
-        </w:rPr>
-        <w:t xml:space="preserve">≥ 30 min de vídeo e ≥ 5 aulas (5 lições, ≈ 40 min), vídeo HD (1080p), grátis abaixo de 2 h, página do curso completa e revisão de qualidade antes de publicar (submeter cedo). </w:t>
-      </w:r>
-      <w:r>
-        <w:rPr>
-          <w:b/>
-          <w:bCs/>
-          <w:sz w:val="20"/>
-          <w:szCs w:val="20"/>
-        </w:rPr>
-        <w:t xml:space="preserve">Matterport: </w:t>
-      </w:r>
-      <w:r>
-        <w:rPr>
-          <w:sz w:val="20"/>
-          <w:szCs w:val="20"/>
-        </w:rPr>
-        <w:t xml:space="preserve">sem iframes, cada lição inclui 1–2 min de vídeo gravado da visita 3D e um link «Visita 3D» nos recursos (opcional, nunca obrigatório para o quiz). Fonte: </w:t>
+        <w:t xml:space="preserve">Analisados: </w:t>
       </w:r>
       <w:hyperlink r:id="rId10" w:history="1">
         <w:r>
@@ -1224,7 +946,7 @@
             <w:szCs w:val="20"/>
             <w:u w:val="single"/>
           </w:rPr>
-          <w:t xml:space="preserve">Udemy — Course quality checklist</w:t>
+          <w:t>iSupport-Portugal (ICBAS-UP)</w:t>
         </w:r>
       </w:hyperlink>
       <w:r>
@@ -1232,12 +954,83 @@
           <w:sz w:val="20"/>
           <w:szCs w:val="20"/>
         </w:rPr>
-        <w:t xml:space="preserve">.</w:t>
+        <w:t xml:space="preserve">; </w:t>
+      </w:r>
+      <w:hyperlink r:id="rId11" w:history="1">
+        <w:r>
+          <w:rPr>
+            <w:color w:val="0563C1"/>
+            <w:sz w:val="20"/>
+            <w:szCs w:val="20"/>
+            <w:u w:val="single"/>
+          </w:rPr>
+          <w:t>NAU «Cuidadores Informais» (ESEP)</w:t>
+        </w:r>
+      </w:hyperlink>
+      <w:r>
+        <w:rPr>
+          <w:sz w:val="20"/>
+          <w:szCs w:val="20"/>
+        </w:rPr>
+        <w:t xml:space="preserve">; </w:t>
+      </w:r>
+      <w:hyperlink r:id="rId12" w:history="1">
+        <w:r>
+          <w:rPr>
+            <w:color w:val="0563C1"/>
+            <w:sz w:val="20"/>
+            <w:szCs w:val="20"/>
+            <w:u w:val="single"/>
+          </w:rPr>
+          <w:t>Curso de Formação de Cuidadores (Santa Maria Saúde)</w:t>
+        </w:r>
+      </w:hyperlink>
+      <w:r>
+        <w:rPr>
+          <w:sz w:val="20"/>
+          <w:szCs w:val="20"/>
+        </w:rPr>
+        <w:t xml:space="preserve">; </w:t>
+      </w:r>
+      <w:hyperlink r:id="rId13" w:history="1">
+        <w:r>
+          <w:rPr>
+            <w:color w:val="0563C1"/>
+            <w:sz w:val="20"/>
+            <w:szCs w:val="20"/>
+            <w:u w:val="single"/>
+          </w:rPr>
+          <w:t>iSupport (OMS)</w:t>
+        </w:r>
+      </w:hyperlink>
+      <w:r>
+        <w:rPr>
+          <w:sz w:val="20"/>
+          <w:szCs w:val="20"/>
+        </w:rPr>
+        <w:t xml:space="preserve">; </w:t>
+      </w:r>
+      <w:hyperlink r:id="rId14" w:history="1">
+        <w:r>
+          <w:rPr>
+            <w:color w:val="0563C1"/>
+            <w:sz w:val="20"/>
+            <w:szCs w:val="20"/>
+            <w:u w:val="single"/>
+          </w:rPr>
+          <w:t>Understanding Dementia (Univ. da Tasmânia)</w:t>
+        </w:r>
+      </w:hyperlink>
+      <w:r>
+        <w:rPr>
+          <w:sz w:val="20"/>
+          <w:szCs w:val="20"/>
+        </w:rPr>
+        <w:t>.</w:t>
       </w:r>
     </w:p>
     <w:p>
       <w:pPr>
-        <w:pageBreakBefore/>
         <w:keepNext/>
         <w:spacing w:before="110" w:after="50"/>
         <w:rPr>
@@ -1253,9 +1046,184 @@
           <w:sz w:val="24"/>
           <w:szCs w:val="24"/>
         </w:rPr>
-        <w:t xml:space="preserve">6. </w:t>
-      </w:r>
-      <w:proofErr w:type="spellStart"/>
+        <w:t>5. Objetivo geral do MOOC</w:t>
+      </w:r>
+    </w:p>
+    <w:p>
+      <w:pPr>
+        <w:spacing w:after="40" w:line="250" w:lineRule="auto"/>
+        <w:rPr>
+          <w:sz w:val="20"/>
+          <w:szCs w:val="20"/>
+        </w:rPr>
+      </w:pPr>
+      <w:r>
+        <w:rPr>
+          <w:sz w:val="20"/>
+          <w:szCs w:val="20"/>
+        </w:rPr>
+        <w:t>No fim do curso, o cuidador é capaz de se preparar para uma situação de crise e de prestar primeiros socorros psicológicos à pessoa com demência e a si próprio: acalmar, responder às necessidades imediatas, manter a rotina possível e reconhecer quando procurar ajuda especializada.</w:t>
+      </w:r>
+    </w:p>
+    <w:p>
+      <w:pPr>
+        <w:spacing w:after="60" w:line="250" w:lineRule="auto"/>
+        <w:rPr>
+          <w:sz w:val="20"/>
+          <w:szCs w:val="20"/>
+        </w:rPr>
+      </w:pPr>
+      <w:r>
+        <w:rPr>
+          <w:b/>
+          <w:bCs/>
+          <w:sz w:val="20"/>
+          <w:szCs w:val="20"/>
+        </w:rPr>
+        <w:t xml:space="preserve">Estrutura: </w:t>
+      </w:r>
+      <w:r>
+        <w:rPr>
+          <w:sz w:val="20"/>
+          <w:szCs w:val="20"/>
+        </w:rPr>
+        <w:t>5 lições de ≈ 8 min (uma por elemento), em sequência temporal; cada lição tem uma componente para a pessoa e outra para o cuidador.</w:t>
+      </w:r>
+    </w:p>
+    <w:p>
+      <w:pPr>
+        <w:spacing w:after="60" w:line="250" w:lineRule="auto"/>
+        <w:rPr>
+          <w:sz w:val="20"/>
+          <w:szCs w:val="20"/>
+        </w:rPr>
+      </w:pPr>
+      <w:r>
+        <w:rPr>
+          <w:b/>
+          <w:bCs/>
+          <w:sz w:val="20"/>
+          <w:szCs w:val="20"/>
+        </w:rPr>
+        <w:t xml:space="preserve">L1 Crise, demência e quem cuida (Compreender, Bruno): </w:t>
+      </w:r>
+      <w:r>
+        <w:rPr>
+          <w:sz w:val="20"/>
+          <w:szCs w:val="20"/>
+        </w:rPr>
+        <w:t>como a crise agrava a confusão, o medo e a agitação; reações normais ao stress; introdução aos PSP (observar, escutar, encaminhar).</w:t>
+      </w:r>
+    </w:p>
+    <w:p>
+      <w:pPr>
+        <w:spacing w:after="60" w:line="250" w:lineRule="auto"/>
+        <w:rPr>
+          <w:sz w:val="20"/>
+          <w:szCs w:val="20"/>
+        </w:rPr>
+      </w:pPr>
+      <w:r>
+        <w:rPr>
+          <w:b/>
+          <w:bCs/>
+          <w:sz w:val="20"/>
+          <w:szCs w:val="20"/>
+        </w:rPr>
+        <w:t xml:space="preserve">L2 Preparar antes (Antes, Tiago): </w:t>
+      </w:r>
+      <w:r>
+        <w:rPr>
+          <w:sz w:val="20"/>
+          <w:szCs w:val="20"/>
+        </w:rPr>
+        <w:t>kit com objetos de conforto e «ficha da pessoa» (o que a acalma e o que a perturba); plano de apoio: rede de contactos e quem substitui o cuidador.</w:t>
+      </w:r>
+    </w:p>
+    <w:p>
+      <w:pPr>
+        <w:spacing w:after="60" w:line="250" w:lineRule="auto"/>
+        <w:rPr>
+          <w:sz w:val="20"/>
+          <w:szCs w:val="20"/>
+        </w:rPr>
+      </w:pPr>
+      <w:r>
+        <w:rPr>
+          <w:b/>
+          <w:bCs/>
+          <w:sz w:val="20"/>
+          <w:szCs w:val="20"/>
+        </w:rPr>
+        <w:t xml:space="preserve">L3 Primeiro contacto: acalmar (Durante, Rodrigo): </w:t>
+      </w:r>
+      <w:r>
+        <w:rPr>
+          <w:sz w:val="20"/>
+          <w:szCs w:val="20"/>
+        </w:rPr>
+        <w:t>observar sinais de angústia, aproximação calma, frases curtas, validar, reduzir estímulos; acalmar-se para acalmar (autorregulação rápida).</w:t>
+      </w:r>
+    </w:p>
+    <w:p>
+      <w:pPr>
+        <w:spacing w:after="60" w:line="250" w:lineRule="auto"/>
+        <w:rPr>
+          <w:sz w:val="20"/>
+          <w:szCs w:val="20"/>
+        </w:rPr>
+      </w:pPr>
+      <w:r>
+        <w:rPr>
+          <w:b/>
+          <w:bCs/>
+          <w:sz w:val="20"/>
+          <w:szCs w:val="20"/>
+        </w:rPr>
+        <w:t xml:space="preserve">L4 Necessidades e encaminhamento (Durante, em casa ou fora, Ricardo): </w:t>
+      </w:r>
+      <w:r>
+        <w:rPr>
+          <w:sz w:val="20"/>
+          <w:szCs w:val="20"/>
+        </w:rPr>
+        <w:t>necessidades básicas, medicação, sinalizar a demência às equipas, sinais de alarme; dizer o que precisa, aceitar ajuda, reconhecer limites.</w:t>
+      </w:r>
+    </w:p>
+    <w:p>
+      <w:pPr>
+        <w:spacing w:after="60" w:line="250" w:lineRule="auto"/>
+        <w:rPr>
+          <w:sz w:val="20"/>
+          <w:szCs w:val="20"/>
+        </w:rPr>
+      </w:pPr>
+      <w:r>
+        <w:rPr>
+          <w:b/>
+          <w:bCs/>
+          <w:sz w:val="20"/>
+          <w:szCs w:val="20"/>
+        </w:rPr>
+        <w:t xml:space="preserve">L5 Depois da crise (Depois, Evandro): </w:t>
+      </w:r>
+      <w:r>
+        <w:rPr>
+          <w:sz w:val="20"/>
+          <w:szCs w:val="20"/>
+        </w:rPr>
+        <w:t>retomar a rotina; vigiar mudanças nas semanas seguintes; sinais de sofrimento prolongado; onde pedir apoio psicológico.</w:t>
+      </w:r>
+    </w:p>
+    <w:p>
+      <w:pPr>
+        <w:keepNext/>
+        <w:spacing w:before="110" w:after="50"/>
+        <w:rPr>
+          <w:sz w:val="20"/>
+          <w:szCs w:val="20"/>
+        </w:rPr>
+      </w:pPr>
       <w:r>
         <w:rPr>
           <w:b/>
@@ -1264,9 +1232,152 @@
           <w:sz w:val="24"/>
           <w:szCs w:val="24"/>
         </w:rPr>
-        <w:t>Gantt</w:t>
-      </w:r>
-      <w:proofErr w:type="spellEnd"/>
+        <w:t>6. Proposta inicial de plataforma</w:t>
+      </w:r>
+    </w:p>
+    <w:p>
+      <w:pPr>
+        <w:spacing w:after="60" w:line="250" w:lineRule="auto"/>
+        <w:rPr>
+          <w:sz w:val="20"/>
+          <w:szCs w:val="20"/>
+        </w:rPr>
+      </w:pPr>
+      <w:r>
+        <w:rPr>
+          <w:b/>
+          <w:bCs/>
+          <w:sz w:val="20"/>
+          <w:szCs w:val="20"/>
+        </w:rPr>
+        <w:t xml:space="preserve">Udemy. </w:t>
+      </w:r>
+      <w:r>
+        <w:rPr>
+          <w:sz w:val="20"/>
+          <w:szCs w:val="20"/>
+        </w:rPr>
+        <w:t>Das três candidatas da S1 (Moodle, Open edX, Udemy) é a única com acesso aberto e massivo sem servidor; o vídeo serve lições de 8 min e tem quizzes nativos. O Moodle exige alojamento e o Open edX uma instalação pesada para o prazo; Coursera, edX.org, FutureLearn e MiríadaX só aceitam parceiros.</w:t>
+      </w:r>
+    </w:p>
+    <w:p>
+      <w:pPr>
+        <w:spacing w:after="60" w:line="250" w:lineRule="auto"/>
+        <w:rPr>
+          <w:sz w:val="20"/>
+          <w:szCs w:val="20"/>
+        </w:rPr>
+      </w:pPr>
+      <w:r>
+        <w:rPr>
+          <w:b/>
+          <w:bCs/>
+          <w:sz w:val="20"/>
+          <w:szCs w:val="20"/>
+        </w:rPr>
+        <w:t xml:space="preserve">Regras da Udemy e como as cumprimos: </w:t>
+      </w:r>
+      <w:r>
+        <w:rPr>
+          <w:sz w:val="20"/>
+          <w:szCs w:val="20"/>
+        </w:rPr>
+        <w:t xml:space="preserve">≥ 30 min de vídeo e ≥ 5 aulas (5 lições, ≈ 40 min), vídeo HD (1080p), grátis abaixo de 2 h, página do curso completa e revisão de qualidade antes de publicar (submeter cedo). </w:t>
+      </w:r>
+      <w:r>
+        <w:rPr>
+          <w:b/>
+          <w:bCs/>
+          <w:sz w:val="20"/>
+          <w:szCs w:val="20"/>
+        </w:rPr>
+        <w:t xml:space="preserve">Matterport: </w:t>
+      </w:r>
+      <w:r>
+        <w:rPr>
+          <w:sz w:val="20"/>
+          <w:szCs w:val="20"/>
+        </w:rPr>
+        <w:t xml:space="preserve">sem iframes, cada lição inclui 1–2 min de vídeo gravado da visita 3D e um link «Visita 3D» nos recursos (opcional, nunca obrigatório para o quiz). Fonte: </w:t>
+      </w:r>
+      <w:hyperlink r:id="rId15" w:history="1">
+        <w:r>
+          <w:rPr>
+            <w:color w:val="0563C1"/>
+            <w:sz w:val="20"/>
+            <w:szCs w:val="20"/>
+            <w:u w:val="single"/>
+          </w:rPr>
+          <w:t xml:space="preserve">Udemy — </w:t>
+        </w:r>
+        <w:proofErr w:type="spellStart"/>
+        <w:r>
+          <w:rPr>
+            <w:color w:val="0563C1"/>
+            <w:sz w:val="20"/>
+            <w:szCs w:val="20"/>
+            <w:u w:val="single"/>
+          </w:rPr>
+          <w:t>Course</w:t>
+        </w:r>
+        <w:proofErr w:type="spellEnd"/>
+        <w:r>
+          <w:rPr>
+            <w:color w:val="0563C1"/>
+            <w:sz w:val="20"/>
+            <w:szCs w:val="20"/>
+            <w:u w:val="single"/>
+          </w:rPr>
+          <w:t xml:space="preserve"> </w:t>
+        </w:r>
+        <w:proofErr w:type="spellStart"/>
+        <w:r>
+          <w:rPr>
+            <w:color w:val="0563C1"/>
+            <w:sz w:val="20"/>
+            <w:szCs w:val="20"/>
+            <w:u w:val="single"/>
+          </w:rPr>
+          <w:t>quality</w:t>
+        </w:r>
+        <w:proofErr w:type="spellEnd"/>
+        <w:r>
+          <w:rPr>
+            <w:color w:val="0563C1"/>
+            <w:sz w:val="20"/>
+            <w:szCs w:val="20"/>
+            <w:u w:val="single"/>
+          </w:rPr>
+          <w:t xml:space="preserve"> </w:t>
+        </w:r>
+        <w:proofErr w:type="spellStart"/>
+        <w:r>
+          <w:rPr>
+            <w:color w:val="0563C1"/>
+            <w:sz w:val="20"/>
+            <w:szCs w:val="20"/>
+            <w:u w:val="single"/>
+          </w:rPr>
+          <w:t>checklist</w:t>
+        </w:r>
+        <w:proofErr w:type="spellEnd"/>
+      </w:hyperlink>
+      <w:r>
+        <w:rPr>
+          <w:sz w:val="20"/>
+          <w:szCs w:val="20"/>
+        </w:rPr>
+        <w:t>.</w:t>
+      </w:r>
+    </w:p>
+    <w:p>
+      <w:pPr>
+        <w:spacing w:after="60" w:line="250" w:lineRule="auto"/>
+        <w:rPr>
+          <w:sz w:val="20"/>
+          <w:szCs w:val="20"/>
+        </w:rPr>
+      </w:pPr>
       <w:r>
         <w:rPr>
           <w:b/>
@@ -1275,97 +1386,30 @@
           <w:sz w:val="24"/>
           <w:szCs w:val="24"/>
         </w:rPr>
+        <w:t xml:space="preserve">7. </w:t>
+      </w:r>
+      <w:proofErr w:type="spellStart"/>
+      <w:r>
+        <w:rPr>
+          <w:b/>
+          <w:bCs/>
+          <w:color w:val="1F4E79"/>
+          <w:sz w:val="24"/>
+          <w:szCs w:val="24"/>
+        </w:rPr>
+        <w:t>Gantt</w:t>
+      </w:r>
+      <w:proofErr w:type="spellEnd"/>
+      <w:r>
+        <w:rPr>
+          <w:b/>
+          <w:bCs/>
+          <w:color w:val="1F4E79"/>
+          <w:sz w:val="24"/>
+          <w:szCs w:val="24"/>
+        </w:rPr>
         <w:t xml:space="preserve"> da equipa</w:t>
       </w:r>
-    </w:p>
-    <w:p>
-      <w:pPr>
-        <w:spacing w:after="50" w:line="230" w:lineRule="auto"/>
-        <w:rPr>
-          <w:sz w:val="20"/>
-          <w:szCs w:val="20"/>
-        </w:rPr>
-      </w:pPr>
-      <w:r>
-        <w:rPr>
-          <w:sz w:val="20"/>
-          <w:szCs w:val="20"/>
-        </w:rPr>
-        <w:t xml:space="preserve">Cada etapa começa na PL de terça e é submetida no Moodle até à PL seguinte; as células sombreadas marcam as semanas de cada tarefa e ◆ a entrega final.</w:t>
-      </w:r>
-    </w:p>
-    <w:p>
-      <w:pPr>
-        <w:spacing w:after="50" w:line="230" w:lineRule="auto"/>
-        <w:rPr>
-          <w:sz w:val="20"/>
-          <w:szCs w:val="20"/>
-        </w:rPr>
-      </w:pPr>
-      <w:r>
-        <w:rPr>
-          <w:sz w:val="20"/>
-          <w:szCs w:val="20"/>
-        </w:rPr>
-        <w:t xml:space="preserve">O Gantt é da equipa e não de cada elemento. As 5 lições seguem o mesmo formato (conteúdo, avaliação e Matterport), por isso cada tarefa avança nas 5 lições ao mesmo tempo. A coluna «Como trabalhamos» diz de que forma:</w:t>
-      </w:r>
-    </w:p>
-    <w:p>
-      <w:pPr>
-        <w:spacing w:after="50" w:line="230" w:lineRule="auto"/>
-        <w:rPr>
-          <w:sz w:val="20"/>
-          <w:szCs w:val="20"/>
-        </w:rPr>
-      </w:pPr>
-      <w:r>
-        <w:rPr>
-          <w:sz w:val="20"/>
-          <w:szCs w:val="20"/>
-        </w:rPr>
-        <w:t xml:space="preserve">• Em conjunto: o grupo decide e faz a tarefa junto, na PL de terça ou em sessões de trabalho do grupo (ex.: identidade visual, captura Matterport, integração na Udemy, testes).</w:t>
-      </w:r>
-    </w:p>
-    <w:p>
-      <w:pPr>
-        <w:spacing w:after="50" w:line="230" w:lineRule="auto"/>
-        <w:rPr>
-          <w:sz w:val="20"/>
-          <w:szCs w:val="20"/>
-        </w:rPr>
-      </w:pPr>
-      <w:r>
-        <w:rPr>
-          <w:sz w:val="20"/>
-          <w:szCs w:val="20"/>
-        </w:rPr>
-        <w:t xml:space="preserve">• Por lição + revisão cruzada: cada elemento faz a parte da sua lição (secção 4) com os modelos comuns, e outro elemento revê-a antes da entrega. Assim as 5 lições ficam coerentes a nível pedagógico, visual e multimédia.</w:t>
-      </w:r>
-    </w:p>
-    <w:p>
-      <w:pPr>
-        <w:spacing w:after="50" w:line="230" w:lineRule="auto"/>
-        <w:rPr>
-          <w:sz w:val="20"/>
-          <w:szCs w:val="20"/>
-        </w:rPr>
-      </w:pPr>
-      <w:r>
-        <w:rPr>
-          <w:sz w:val="20"/>
-          <w:szCs w:val="20"/>
-        </w:rPr>
-        <w:t xml:space="preserve">• Em cada semana o grupo junta o trabalho numa só submissão e decide, com o feedback recebido, o que muda na semana seguinte.</w:t>
-      </w:r>
-    </w:p>
-    <w:p>
-      <w:pPr>
-        <w:spacing w:after="50" w:line="230" w:lineRule="auto"/>
-        <w:rPr>
-          <w:sz w:val="22"/>
-          <w:szCs w:val="22"/>
-        </w:rPr>
-      </w:pPr>
     </w:p>
     <w:tbl>
       <w:tblPr>
@@ -1396,12 +1440,6 @@
         <w:gridCol w:w="786"/>
       </w:tblGrid>
       <w:tr>
-        <w:tblPrEx>
-          <w:tblCellMar>
-            <w:top w:w="0" w:type="dxa"/>
-            <w:bottom w:w="0" w:type="dxa"/>
-          </w:tblCellMar>
-        </w:tblPrEx>
         <w:trPr>
           <w:tblHeader/>
         </w:trPr>
@@ -1815,12 +1853,6 @@
         </w:tc>
       </w:tr>
       <w:tr>
-        <w:tblPrEx>
-          <w:tblCellMar>
-            <w:top w:w="0" w:type="dxa"/>
-            <w:bottom w:w="0" w:type="dxa"/>
-          </w:tblCellMar>
-        </w:tblPrEx>
         <w:trPr>
           <w:cantSplit/>
         </w:trPr>
@@ -1854,7 +1886,7 @@
                 <w:sz w:val="16"/>
                 <w:szCs w:val="16"/>
               </w:rPr>
-              <w:t xml:space="preserve">Tema, enquadramento e público-alvo</w:t>
+              <w:t>Tema, enquadramento e público-alvo</w:t>
             </w:r>
           </w:p>
         </w:tc>
@@ -1884,7 +1916,7 @@
                 <w:sz w:val="15"/>
                 <w:szCs w:val="15"/>
               </w:rPr>
-              <w:t xml:space="preserve">Em conjunto</w:t>
+              <w:t>Em conjunto</w:t>
             </w:r>
           </w:p>
         </w:tc>
@@ -2059,12 +2091,6 @@
         </w:tc>
       </w:tr>
       <w:tr>
-        <w:tblPrEx>
-          <w:tblCellMar>
-            <w:top w:w="0" w:type="dxa"/>
-            <w:bottom w:w="0" w:type="dxa"/>
-          </w:tblCellMar>
-        </w:tblPrEx>
         <w:trPr>
           <w:cantSplit/>
         </w:trPr>
@@ -2098,7 +2124,7 @@
                 <w:sz w:val="16"/>
                 <w:szCs w:val="16"/>
               </w:rPr>
-              <w:t xml:space="preserve">Pesquisa de MOOCs e escolha da plataforma</w:t>
+              <w:t>Pesquisa de MOOCs e escolha da plataforma</w:t>
             </w:r>
           </w:p>
         </w:tc>
@@ -2128,7 +2154,7 @@
                 <w:sz w:val="15"/>
                 <w:szCs w:val="15"/>
               </w:rPr>
-              <w:t xml:space="preserve">Em conjunto</w:t>
+              <w:t>Em conjunto</w:t>
             </w:r>
           </w:p>
         </w:tc>
@@ -2303,12 +2329,6 @@
         </w:tc>
       </w:tr>
       <w:tr>
-        <w:tblPrEx>
-          <w:tblCellMar>
-            <w:top w:w="0" w:type="dxa"/>
-            <w:bottom w:w="0" w:type="dxa"/>
-          </w:tblCellMar>
-        </w:tblPrEx>
         <w:trPr>
           <w:cantSplit/>
         </w:trPr>
@@ -2342,7 +2362,7 @@
                 <w:sz w:val="16"/>
                 <w:szCs w:val="16"/>
               </w:rPr>
-              <w:t xml:space="preserve">Planeamento e Gantt da equipa</w:t>
+              <w:t>Planeamento e Gantt da equipa</w:t>
             </w:r>
           </w:p>
         </w:tc>
@@ -2372,7 +2392,7 @@
                 <w:sz w:val="15"/>
                 <w:szCs w:val="15"/>
               </w:rPr>
-              <w:t xml:space="preserve">Em conjunto</w:t>
+              <w:t>Em conjunto</w:t>
             </w:r>
           </w:p>
         </w:tc>
@@ -2547,12 +2567,6 @@
         </w:tc>
       </w:tr>
       <w:tr>
-        <w:tblPrEx>
-          <w:tblCellMar>
-            <w:top w:w="0" w:type="dxa"/>
-            <w:bottom w:w="0" w:type="dxa"/>
-          </w:tblCellMar>
-        </w:tblPrEx>
         <w:trPr>
           <w:cantSplit/>
         </w:trPr>
@@ -2586,7 +2600,7 @@
                 <w:sz w:val="16"/>
                 <w:szCs w:val="16"/>
               </w:rPr>
-              <w:t xml:space="preserve">MOOC Template: formato comum e objetivos das 5 lições</w:t>
+              <w:t>MOOC Template: formato comum e objetivos das 5 lições</w:t>
             </w:r>
           </w:p>
         </w:tc>
@@ -2616,7 +2630,7 @@
                 <w:sz w:val="15"/>
                 <w:szCs w:val="15"/>
               </w:rPr>
-              <w:t xml:space="preserve">Por lição + revisão cruzada</w:t>
+              <w:t>Por lição + revisão cruzada</w:t>
             </w:r>
           </w:p>
         </w:tc>
@@ -2791,12 +2805,6 @@
         </w:tc>
       </w:tr>
       <w:tr>
-        <w:tblPrEx>
-          <w:tblCellMar>
-            <w:top w:w="0" w:type="dxa"/>
-            <w:bottom w:w="0" w:type="dxa"/>
-          </w:tblCellMar>
-        </w:tblPrEx>
         <w:trPr>
           <w:cantSplit/>
         </w:trPr>
@@ -2830,7 +2838,7 @@
                 <w:sz w:val="16"/>
                 <w:szCs w:val="16"/>
               </w:rPr>
-              <w:t xml:space="preserve">Escolha e autorização dos espaços Matterport</w:t>
+              <w:t>Escolha e autorização dos espaços Matterport</w:t>
             </w:r>
           </w:p>
         </w:tc>
@@ -2860,7 +2868,7 @@
                 <w:sz w:val="15"/>
                 <w:szCs w:val="15"/>
               </w:rPr>
-              <w:t xml:space="preserve">Em conjunto</w:t>
+              <w:t>Em conjunto</w:t>
             </w:r>
           </w:p>
         </w:tc>
@@ -3035,12 +3043,6 @@
         </w:tc>
       </w:tr>
       <w:tr>
-        <w:tblPrEx>
-          <w:tblCellMar>
-            <w:top w:w="0" w:type="dxa"/>
-            <w:bottom w:w="0" w:type="dxa"/>
-          </w:tblCellMar>
-        </w:tblPrEx>
         <w:trPr>
           <w:cantSplit/>
         </w:trPr>
@@ -3074,7 +3076,7 @@
                 <w:sz w:val="16"/>
                 <w:szCs w:val="16"/>
               </w:rPr>
-              <w:t xml:space="preserve">Identidade visual e modelos comuns</w:t>
+              <w:t>Identidade visual e modelos comuns</w:t>
             </w:r>
           </w:p>
         </w:tc>
@@ -3104,7 +3106,7 @@
                 <w:sz w:val="15"/>
                 <w:szCs w:val="15"/>
               </w:rPr>
-              <w:t xml:space="preserve">Em conjunto</w:t>
+              <w:t>Em conjunto</w:t>
             </w:r>
           </w:p>
         </w:tc>
@@ -3280,12 +3282,6 @@
         </w:tc>
       </w:tr>
       <w:tr>
-        <w:tblPrEx>
-          <w:tblCellMar>
-            <w:top w:w="0" w:type="dxa"/>
-            <w:bottom w:w="0" w:type="dxa"/>
-          </w:tblCellMar>
-        </w:tblPrEx>
         <w:trPr>
           <w:cantSplit/>
         </w:trPr>
@@ -3319,7 +3315,7 @@
                 <w:sz w:val="16"/>
                 <w:szCs w:val="16"/>
               </w:rPr>
-              <w:t xml:space="preserve">Guiões e storyboards</w:t>
+              <w:t>Guiões e storyboards</w:t>
             </w:r>
           </w:p>
         </w:tc>
@@ -3349,7 +3345,7 @@
                 <w:sz w:val="15"/>
                 <w:szCs w:val="15"/>
               </w:rPr>
-              <w:t xml:space="preserve">Por lição + revisão cruzada</w:t>
+              <w:t>Por lição + revisão cruzada</w:t>
             </w:r>
           </w:p>
         </w:tc>
@@ -3524,12 +3520,6 @@
         </w:tc>
       </w:tr>
       <w:tr>
-        <w:tblPrEx>
-          <w:tblCellMar>
-            <w:top w:w="0" w:type="dxa"/>
-            <w:bottom w:w="0" w:type="dxa"/>
-          </w:tblCellMar>
-        </w:tblPrEx>
         <w:trPr>
           <w:cantSplit/>
         </w:trPr>
@@ -3563,7 +3553,7 @@
                 <w:sz w:val="16"/>
                 <w:szCs w:val="16"/>
               </w:rPr>
-              <w:t xml:space="preserve">Captura Matterport e tags</w:t>
+              <w:t>Captura Matterport e tags</w:t>
             </w:r>
           </w:p>
         </w:tc>
@@ -3593,7 +3583,7 @@
                 <w:sz w:val="15"/>
                 <w:szCs w:val="15"/>
               </w:rPr>
-              <w:t xml:space="preserve">Em conjunto</w:t>
+              <w:t>Em conjunto</w:t>
             </w:r>
           </w:p>
         </w:tc>
@@ -3768,12 +3758,6 @@
         </w:tc>
       </w:tr>
       <w:tr>
-        <w:tblPrEx>
-          <w:tblCellMar>
-            <w:top w:w="0" w:type="dxa"/>
-            <w:bottom w:w="0" w:type="dxa"/>
-          </w:tblCellMar>
-        </w:tblPrEx>
         <w:trPr>
           <w:cantSplit/>
         </w:trPr>
@@ -3807,7 +3791,7 @@
                 <w:sz w:val="16"/>
                 <w:szCs w:val="16"/>
               </w:rPr>
-              <w:t xml:space="preserve">Conta e página do curso na Udemy</w:t>
+              <w:t>Conta e página do curso na Udemy</w:t>
             </w:r>
           </w:p>
         </w:tc>
@@ -3837,7 +3821,7 @@
                 <w:sz w:val="15"/>
                 <w:szCs w:val="15"/>
               </w:rPr>
-              <w:t xml:space="preserve">Em conjunto</w:t>
+              <w:t>Em conjunto</w:t>
             </w:r>
           </w:p>
         </w:tc>
@@ -4012,12 +3996,6 @@
         </w:tc>
       </w:tr>
       <w:tr>
-        <w:tblPrEx>
-          <w:tblCellMar>
-            <w:top w:w="0" w:type="dxa"/>
-            <w:bottom w:w="0" w:type="dxa"/>
-          </w:tblCellMar>
-        </w:tblPrEx>
         <w:trPr>
           <w:cantSplit/>
         </w:trPr>
@@ -4051,7 +4029,7 @@
                 <w:sz w:val="16"/>
                 <w:szCs w:val="16"/>
               </w:rPr>
-              <w:t xml:space="preserve">Conteúdo: vídeos das lições</w:t>
+              <w:t>Conteúdo: vídeos das lições</w:t>
             </w:r>
           </w:p>
         </w:tc>
@@ -4081,7 +4059,7 @@
                 <w:sz w:val="15"/>
                 <w:szCs w:val="15"/>
               </w:rPr>
-              <w:t xml:space="preserve">Por lição + revisão cruzada</w:t>
+              <w:t>Por lição + revisão cruzada</w:t>
             </w:r>
           </w:p>
         </w:tc>
@@ -4257,12 +4235,6 @@
         </w:tc>
       </w:tr>
       <w:tr>
-        <w:tblPrEx>
-          <w:tblCellMar>
-            <w:top w:w="0" w:type="dxa"/>
-            <w:bottom w:w="0" w:type="dxa"/>
-          </w:tblCellMar>
-        </w:tblPrEx>
         <w:trPr>
           <w:cantSplit/>
         </w:trPr>
@@ -4296,7 +4268,7 @@
                 <w:sz w:val="16"/>
                 <w:szCs w:val="16"/>
               </w:rPr>
-              <w:t xml:space="preserve">Matterport: visita guiada e vídeo de cada lição</w:t>
+              <w:t>Matterport: visita guiada e vídeo de cada lição</w:t>
             </w:r>
           </w:p>
         </w:tc>
@@ -4326,7 +4298,7 @@
                 <w:sz w:val="15"/>
                 <w:szCs w:val="15"/>
               </w:rPr>
-              <w:t xml:space="preserve">Por lição + revisão cruzada</w:t>
+              <w:t>Por lição + revisão cruzada</w:t>
             </w:r>
           </w:p>
         </w:tc>
@@ -4501,12 +4473,6 @@
         </w:tc>
       </w:tr>
       <w:tr>
-        <w:tblPrEx>
-          <w:tblCellMar>
-            <w:top w:w="0" w:type="dxa"/>
-            <w:bottom w:w="0" w:type="dxa"/>
-          </w:tblCellMar>
-        </w:tblPrEx>
         <w:trPr>
           <w:cantSplit/>
         </w:trPr>
@@ -4540,7 +4506,7 @@
                 <w:sz w:val="16"/>
                 <w:szCs w:val="16"/>
               </w:rPr>
-              <w:t xml:space="preserve">Avaliação: atividades e quizzes</w:t>
+              <w:t>Avaliação: atividades e quizzes</w:t>
             </w:r>
           </w:p>
         </w:tc>
@@ -4570,7 +4536,7 @@
                 <w:sz w:val="15"/>
                 <w:szCs w:val="15"/>
               </w:rPr>
-              <w:t xml:space="preserve">Por lição + revisão cruzada</w:t>
+              <w:t>Por lição + revisão cruzada</w:t>
             </w:r>
           </w:p>
         </w:tc>
@@ -4745,12 +4711,6 @@
         </w:tc>
       </w:tr>
       <w:tr>
-        <w:tblPrEx>
-          <w:tblCellMar>
-            <w:top w:w="0" w:type="dxa"/>
-            <w:bottom w:w="0" w:type="dxa"/>
-          </w:tblCellMar>
-        </w:tblPrEx>
         <w:trPr>
           <w:cantSplit/>
         </w:trPr>
@@ -4784,7 +4744,7 @@
                 <w:sz w:val="16"/>
                 <w:szCs w:val="16"/>
               </w:rPr>
-              <w:t xml:space="preserve">Protótipo e teste entre colegas (SUS)</w:t>
+              <w:t>Protótipo e teste entre colegas (SUS)</w:t>
             </w:r>
           </w:p>
         </w:tc>
@@ -4814,7 +4774,7 @@
                 <w:sz w:val="15"/>
                 <w:szCs w:val="15"/>
               </w:rPr>
-              <w:t xml:space="preserve">Em conjunto</w:t>
+              <w:t>Em conjunto</w:t>
             </w:r>
           </w:p>
         </w:tc>
@@ -4989,12 +4949,6 @@
         </w:tc>
       </w:tr>
       <w:tr>
-        <w:tblPrEx>
-          <w:tblCellMar>
-            <w:top w:w="0" w:type="dxa"/>
-            <w:bottom w:w="0" w:type="dxa"/>
-          </w:tblCellMar>
-        </w:tblPrEx>
         <w:trPr>
           <w:cantSplit/>
         </w:trPr>
@@ -5028,7 +4982,7 @@
                 <w:sz w:val="16"/>
                 <w:szCs w:val="16"/>
               </w:rPr>
-              <w:t xml:space="preserve">Integração na Udemy, navegação e legendas</w:t>
+              <w:t>Integração na Udemy, navegação e legendas</w:t>
             </w:r>
           </w:p>
         </w:tc>
@@ -5058,7 +5012,7 @@
                 <w:sz w:val="15"/>
                 <w:szCs w:val="15"/>
               </w:rPr>
-              <w:t xml:space="preserve">Em conjunto</w:t>
+              <w:t>Em conjunto</w:t>
             </w:r>
           </w:p>
         </w:tc>
@@ -5233,12 +5187,6 @@
         </w:tc>
       </w:tr>
       <w:tr>
-        <w:tblPrEx>
-          <w:tblCellMar>
-            <w:top w:w="0" w:type="dxa"/>
-            <w:bottom w:w="0" w:type="dxa"/>
-          </w:tblCellMar>
-        </w:tblPrEx>
         <w:trPr>
           <w:cantSplit/>
         </w:trPr>
@@ -5272,7 +5220,7 @@
                 <w:sz w:val="16"/>
                 <w:szCs w:val="16"/>
               </w:rPr>
-              <w:t xml:space="preserve">Revisão de qualidade da Udemy</w:t>
+              <w:t>Revisão de qualidade da Udemy</w:t>
             </w:r>
           </w:p>
         </w:tc>
@@ -5302,7 +5250,7 @@
                 <w:sz w:val="15"/>
                 <w:szCs w:val="15"/>
               </w:rPr>
-              <w:t xml:space="preserve">Em conjunto</w:t>
+              <w:t>Em conjunto</w:t>
             </w:r>
           </w:p>
         </w:tc>
@@ -5478,12 +5426,6 @@
         </w:tc>
       </w:tr>
       <w:tr>
-        <w:tblPrEx>
-          <w:tblCellMar>
-            <w:top w:w="0" w:type="dxa"/>
-            <w:bottom w:w="0" w:type="dxa"/>
-          </w:tblCellMar>
-        </w:tblPrEx>
         <w:trPr>
           <w:cantSplit/>
         </w:trPr>
@@ -5517,7 +5459,7 @@
                 <w:sz w:val="16"/>
                 <w:szCs w:val="16"/>
               </w:rPr>
-              <w:t xml:space="preserve">Testes com o público-alvo</w:t>
+              <w:t>Testes com o público-alvo</w:t>
             </w:r>
           </w:p>
         </w:tc>
@@ -5547,7 +5489,7 @@
                 <w:sz w:val="15"/>
                 <w:szCs w:val="15"/>
               </w:rPr>
-              <w:t xml:space="preserve">Em conjunto</w:t>
+              <w:t>Em conjunto</w:t>
             </w:r>
           </w:p>
         </w:tc>
@@ -5722,12 +5664,6 @@
         </w:tc>
       </w:tr>
       <w:tr>
-        <w:tblPrEx>
-          <w:tblCellMar>
-            <w:top w:w="0" w:type="dxa"/>
-            <w:bottom w:w="0" w:type="dxa"/>
-          </w:tblCellMar>
-        </w:tblPrEx>
         <w:trPr>
           <w:cantSplit/>
         </w:trPr>
@@ -5761,7 +5697,7 @@
                 <w:sz w:val="16"/>
                 <w:szCs w:val="16"/>
               </w:rPr>
-              <w:t xml:space="preserve">Correções e melhorias</w:t>
+              <w:t>Correções e melhorias</w:t>
             </w:r>
           </w:p>
         </w:tc>
@@ -5791,7 +5727,7 @@
                 <w:sz w:val="15"/>
                 <w:szCs w:val="15"/>
               </w:rPr>
-              <w:t xml:space="preserve">Em conjunto</w:t>
+              <w:t>Em conjunto</w:t>
             </w:r>
           </w:p>
         </w:tc>
@@ -5966,12 +5902,6 @@
         </w:tc>
       </w:tr>
       <w:tr>
-        <w:tblPrEx>
-          <w:tblCellMar>
-            <w:top w:w="0" w:type="dxa"/>
-            <w:bottom w:w="0" w:type="dxa"/>
-          </w:tblCellMar>
-        </w:tblPrEx>
         <w:trPr>
           <w:cantSplit/>
         </w:trPr>
@@ -6005,7 +5935,7 @@
                 <w:sz w:val="16"/>
                 <w:szCs w:val="16"/>
               </w:rPr>
-              <w:t xml:space="preserve">Relatório final e diretrizes da Udemy</w:t>
+              <w:t>Relatório final e diretrizes da Udemy</w:t>
             </w:r>
           </w:p>
         </w:tc>
@@ -6035,7 +5965,7 @@
                 <w:sz w:val="15"/>
                 <w:szCs w:val="15"/>
               </w:rPr>
-              <w:t xml:space="preserve">Em conjunto</w:t>
+              <w:t>Em conjunto</w:t>
             </w:r>
           </w:p>
         </w:tc>
@@ -6210,12 +6140,6 @@
         </w:tc>
       </w:tr>
       <w:tr>
-        <w:tblPrEx>
-          <w:tblCellMar>
-            <w:top w:w="0" w:type="dxa"/>
-            <w:bottom w:w="0" w:type="dxa"/>
-          </w:tblCellMar>
-        </w:tblPrEx>
         <w:trPr>
           <w:cantSplit/>
         </w:trPr>
@@ -6249,7 +6173,7 @@
                 <w:sz w:val="16"/>
                 <w:szCs w:val="16"/>
               </w:rPr>
-              <w:t xml:space="preserve">Entrega final e apresentação presencial</w:t>
+              <w:t>Entrega final e apresentação presencial</w:t>
             </w:r>
           </w:p>
         </w:tc>
@@ -6279,7 +6203,7 @@
                 <w:sz w:val="15"/>
                 <w:szCs w:val="15"/>
               </w:rPr>
-              <w:t xml:space="preserve">Em conjunto</w:t>
+              <w:t>Em conjunto</w:t>
             </w:r>
           </w:p>
         </w:tc>
@@ -6464,7 +6388,7 @@
     </w:tbl>
     <w:p/>
     <w:sectPr>
-      <w:footerReference w:type="default" r:id="rId11"/>
+      <w:footerReference w:type="default" r:id="rId16"/>
       <w:pgSz w:w="11906" w:h="16838"/>
       <w:pgMar w:top="850" w:right="964" w:bottom="800" w:left="964" w:header="400" w:footer="400" w:gutter="0"/>
       <w:cols w:space="720"/>
@@ -7063,7 +6987,7 @@
     <w:name w:val="Normal"/>
     <w:qFormat/>
   </w:style>
-  <w:style w:type="paragraph" w:styleId="Ttulo1">
+  <w:style w:type="paragraph" w:styleId="Heading1">
     <w:name w:val="heading 1"/>
     <w:uiPriority w:val="9"/>
     <w:qFormat/>
@@ -7076,7 +7000,7 @@
       <w:szCs w:val="32"/>
     </w:rPr>
   </w:style>
-  <w:style w:type="paragraph" w:styleId="Ttulo2">
+  <w:style w:type="paragraph" w:styleId="Heading2">
     <w:name w:val="heading 2"/>
     <w:uiPriority w:val="9"/>
     <w:semiHidden/>
@@ -7091,7 +7015,7 @@
       <w:szCs w:val="26"/>
     </w:rPr>
   </w:style>
-  <w:style w:type="paragraph" w:styleId="Ttulo3">
+  <w:style w:type="paragraph" w:styleId="Heading3">
     <w:name w:val="heading 3"/>
     <w:uiPriority w:val="9"/>
     <w:semiHidden/>
@@ -7106,7 +7030,7 @@
       <w:szCs w:val="24"/>
     </w:rPr>
   </w:style>
-  <w:style w:type="paragraph" w:styleId="Ttulo4">
+  <w:style w:type="paragraph" w:styleId="Heading4">
     <w:name w:val="heading 4"/>
     <w:uiPriority w:val="9"/>
     <w:semiHidden/>
@@ -7121,7 +7045,7 @@
       <w:color w:val="2E74B5"/>
     </w:rPr>
   </w:style>
-  <w:style w:type="paragraph" w:styleId="Ttulo5">
+  <w:style w:type="paragraph" w:styleId="Heading5">
     <w:name w:val="heading 5"/>
     <w:uiPriority w:val="9"/>
     <w:semiHidden/>
@@ -7134,7 +7058,7 @@
       <w:color w:val="2E74B5"/>
     </w:rPr>
   </w:style>
-  <w:style w:type="paragraph" w:styleId="Ttulo6">
+  <w:style w:type="paragraph" w:styleId="Heading6">
     <w:name w:val="heading 6"/>
     <w:uiPriority w:val="9"/>
     <w:semiHidden/>
@@ -7147,13 +7071,13 @@
       <w:color w:val="1F4D78"/>
     </w:rPr>
   </w:style>
-  <w:style w:type="character" w:default="1" w:styleId="Tipodeletrapredefinidodopargrafo">
+  <w:style w:type="character" w:default="1" w:styleId="DefaultParagraphFont">
     <w:name w:val="Default Paragraph Font"/>
     <w:uiPriority w:val="1"/>
     <w:semiHidden/>
     <w:unhideWhenUsed/>
   </w:style>
-  <w:style w:type="table" w:default="1" w:styleId="Tabelanormal">
+  <w:style w:type="table" w:default="1" w:styleId="TableNormal">
     <w:name w:val="Normal Table"/>
     <w:uiPriority w:val="99"/>
     <w:semiHidden/>
@@ -7168,13 +7092,13 @@
       </w:tblCellMar>
     </w:tblPr>
   </w:style>
-  <w:style w:type="numbering" w:default="1" w:styleId="Semlista">
+  <w:style w:type="numbering" w:default="1" w:styleId="NoList">
     <w:name w:val="No List"/>
     <w:uiPriority w:val="99"/>
     <w:semiHidden/>
     <w:unhideWhenUsed/>
   </w:style>
-  <w:style w:type="paragraph" w:styleId="Ttulo">
+  <w:style w:type="paragraph" w:styleId="Title">
     <w:name w:val="Title"/>
     <w:uiPriority w:val="10"/>
     <w:qFormat/>
@@ -7191,11 +7115,11 @@
       <w:bCs/>
     </w:rPr>
   </w:style>
-  <w:style w:type="paragraph" w:styleId="PargrafodaLista">
+  <w:style w:type="paragraph" w:styleId="ListParagraph">
     <w:name w:val="List Paragraph"/>
     <w:qFormat/>
   </w:style>
-  <w:style w:type="character" w:styleId="Hiperligao">
+  <w:style w:type="character" w:styleId="Hyperlink">
     <w:name w:val="Hyperlink"/>
     <w:uiPriority w:val="99"/>
     <w:unhideWhenUsed/>
@@ -7204,7 +7128,7 @@
       <w:u w:val="single"/>
     </w:rPr>
   </w:style>
-  <w:style w:type="character" w:styleId="Refdenotaderodap">
+  <w:style w:type="character" w:styleId="FootnoteReference">
     <w:name w:val="footnote reference"/>
     <w:uiPriority w:val="99"/>
     <w:semiHidden/>
@@ -7213,9 +7137,9 @@
       <w:vertAlign w:val="superscript"/>
     </w:rPr>
   </w:style>
-  <w:style w:type="paragraph" w:styleId="Textodenotaderodap">
+  <w:style w:type="paragraph" w:styleId="FootnoteText">
     <w:name w:val="footnote text"/>
-    <w:link w:val="TextodenotaderodapCarter"/>
+    <w:link w:val="FootnoteTextChar"/>
     <w:uiPriority w:val="99"/>
     <w:semiHidden/>
     <w:unhideWhenUsed/>
@@ -7224,9 +7148,9 @@
       <w:szCs w:val="20"/>
     </w:rPr>
   </w:style>
-  <w:style w:type="character" w:customStyle="1" w:styleId="TextodenotaderodapCarter">
-    <w:name w:val="Texto de nota de rodapé Caráter"/>
-    <w:link w:val="Textodenotaderodap"/>
+  <w:style w:type="character" w:customStyle="1" w:styleId="FootnoteTextChar">
+    <w:name w:val="Footnote Text Char"/>
+    <w:link w:val="FootnoteText"/>
     <w:uiPriority w:val="99"/>
     <w:semiHidden/>
     <w:unhideWhenUsed/>
@@ -7235,7 +7159,7 @@
       <w:szCs w:val="20"/>
     </w:rPr>
   </w:style>
-  <w:style w:type="character" w:styleId="Refdenotadefim">
+  <w:style w:type="character" w:styleId="EndnoteReference">
     <w:name w:val="endnote reference"/>
     <w:uiPriority w:val="99"/>
     <w:semiHidden/>
@@ -7244,9 +7168,9 @@
       <w:vertAlign w:val="superscript"/>
     </w:rPr>
   </w:style>
-  <w:style w:type="paragraph" w:styleId="Textodenotadefim">
+  <w:style w:type="paragraph" w:styleId="EndnoteText">
     <w:name w:val="endnote text"/>
-    <w:link w:val="TextodenotadefimCarter"/>
+    <w:link w:val="EndnoteTextChar"/>
     <w:uiPriority w:val="99"/>
     <w:semiHidden/>
     <w:unhideWhenUsed/>
@@ -7255,9 +7179,9 @@
       <w:szCs w:val="20"/>
     </w:rPr>
   </w:style>
-  <w:style w:type="character" w:customStyle="1" w:styleId="TextodenotadefimCarter">
-    <w:name w:val="Texto de nota de fim Caráter"/>
-    <w:link w:val="Textodenotadefim"/>
+  <w:style w:type="character" w:customStyle="1" w:styleId="EndnoteTextChar">
+    <w:name w:val="Endnote Text Char"/>
+    <w:link w:val="EndnoteText"/>
     <w:uiPriority w:val="99"/>
     <w:semiHidden/>
     <w:unhideWhenUsed/>

</xml_diff>